<commit_message>
Update biometric module comments after teammates' changes
Correct six comments that no longer matched the code: the schedule
read returns all slots with counts, closing a day keeps checked-in
bookings, the pass shows EXPIRED, the policy covers walk-in cancel
rules, and an officer now chooses the slot for a missed booking.
Comments only, no code changes.
</commit_message>
<xml_diff>
--- a/output/Biometric_And_Appointment_Mgmt_Guide.docx
+++ b/output/Biometric_And_Appointment_Mgmt_Guide.docx
@@ -11989,7 +11989,1246 @@
         <w:keepNext/>
       </w:pPr>
       <w:r>
-        <w:t xml:space="preserve">12. Tests</w:t>
+        <w:t xml:space="preserve">12. Testing</w:t>
+      </w:r>
+    </w:p>
+    <w:p>
+      <w:pPr>
+        <w:spacing w:after="100" w:line="276"/>
+      </w:pPr>
+      <w:r>
+        <w:t xml:space="preserve">My module has </w:t>
+      </w:r>
+      <w:r>
+        <w:rPr>
+          <w:b/>
+          <w:bCs/>
+        </w:rPr>
+        <w:t xml:space="preserve">46 automated tests</w:t>
+      </w:r>
+      <w:r>
+        <w:t xml:space="preserve">: 18 that run on their own, and 28 that run the whole application against the real database. Each test checks one rule or one workflow, and the test method names read like sentences.</w:t>
+      </w:r>
+    </w:p>
+    <w:p>
+      <w:pPr>
+        <w:pStyle w:val="Heading2"/>
+        <w:keepNext/>
+      </w:pPr>
+      <w:r>
+        <w:t xml:space="preserve">12.1 Types of testing used</w:t>
+      </w:r>
+    </w:p>
+    <w:tbl>
+      <w:tblPr>
+        <w:tblW w:type="dxa" w:w="9638"/>
+        <w:tblBorders>
+          <w:top w:val="single" w:color="auto" w:sz="4"/>
+          <w:left w:val="single" w:color="auto" w:sz="4"/>
+          <w:bottom w:val="single" w:color="auto" w:sz="4"/>
+          <w:right w:val="single" w:color="auto" w:sz="4"/>
+          <w:insideH w:val="single" w:color="auto" w:sz="4"/>
+          <w:insideV w:val="single" w:color="auto" w:sz="4"/>
+        </w:tblBorders>
+        <w:tblLayout w:type="fixed"/>
+      </w:tblPr>
+      <w:tblGrid>
+        <w:gridCol w:w="2200"/>
+        <w:gridCol w:w="1000"/>
+        <w:gridCol w:w="4138"/>
+        <w:gridCol w:w="2300"/>
+      </w:tblGrid>
+      <w:tr>
+        <w:trPr>
+          <w:cantSplit/>
+          <w:tblHeader/>
+        </w:trPr>
+        <w:tc>
+          <w:tcPr>
+            <w:tcW w:type="dxa" w:w="2200"/>
+            <w:tcBorders>
+              <w:top w:val="single" w:color="D9D2C3" w:sz="4"/>
+              <w:left w:val="single" w:color="D9D2C3" w:sz="4"/>
+              <w:bottom w:val="single" w:color="D9D2C3" w:sz="4"/>
+              <w:right w:val="single" w:color="D9D2C3" w:sz="4"/>
+            </w:tcBorders>
+            <w:shd w:fill="681042" w:color="auto" w:val="clear"/>
+            <w:tcMar>
+              <w:top w:type="dxa" w:w="70"/>
+              <w:left w:type="dxa" w:w="100"/>
+              <w:bottom w:type="dxa" w:w="50"/>
+              <w:right w:type="dxa" w:w="100"/>
+            </w:tcMar>
+          </w:tcPr>
+          <w:p>
+            <w:pPr>
+              <w:spacing w:after="40" w:line="252"/>
+            </w:pPr>
+            <w:r>
+              <w:rPr>
+                <w:b/>
+                <w:bCs/>
+                <w:color w:val="FFFFFF"/>
+                <w:sz w:val="18"/>
+                <w:szCs w:val="18"/>
+              </w:rPr>
+              <w:t xml:space="preserve">Type</w:t>
+            </w:r>
+          </w:p>
+        </w:tc>
+        <w:tc>
+          <w:tcPr>
+            <w:tcW w:type="dxa" w:w="1000"/>
+            <w:tcBorders>
+              <w:top w:val="single" w:color="D9D2C3" w:sz="4"/>
+              <w:left w:val="single" w:color="D9D2C3" w:sz="4"/>
+              <w:bottom w:val="single" w:color="D9D2C3" w:sz="4"/>
+              <w:right w:val="single" w:color="D9D2C3" w:sz="4"/>
+            </w:tcBorders>
+            <w:shd w:fill="681042" w:color="auto" w:val="clear"/>
+            <w:tcMar>
+              <w:top w:type="dxa" w:w="70"/>
+              <w:left w:type="dxa" w:w="100"/>
+              <w:bottom w:type="dxa" w:w="50"/>
+              <w:right w:type="dxa" w:w="100"/>
+            </w:tcMar>
+          </w:tcPr>
+          <w:p>
+            <w:pPr>
+              <w:spacing w:after="40" w:line="252"/>
+            </w:pPr>
+            <w:r>
+              <w:rPr>
+                <w:b/>
+                <w:bCs/>
+                <w:color w:val="FFFFFF"/>
+                <w:sz w:val="18"/>
+                <w:szCs w:val="18"/>
+              </w:rPr>
+              <w:t xml:space="preserve">Box</w:t>
+            </w:r>
+          </w:p>
+        </w:tc>
+        <w:tc>
+          <w:tcPr>
+            <w:tcW w:type="dxa" w:w="4138"/>
+            <w:tcBorders>
+              <w:top w:val="single" w:color="D9D2C3" w:sz="4"/>
+              <w:left w:val="single" w:color="D9D2C3" w:sz="4"/>
+              <w:bottom w:val="single" w:color="D9D2C3" w:sz="4"/>
+              <w:right w:val="single" w:color="D9D2C3" w:sz="4"/>
+            </w:tcBorders>
+            <w:shd w:fill="681042" w:color="auto" w:val="clear"/>
+            <w:tcMar>
+              <w:top w:type="dxa" w:w="70"/>
+              <w:left w:type="dxa" w:w="100"/>
+              <w:bottom w:type="dxa" w:w="50"/>
+              <w:right w:type="dxa" w:w="100"/>
+            </w:tcMar>
+          </w:tcPr>
+          <w:p>
+            <w:pPr>
+              <w:spacing w:after="40" w:line="252"/>
+            </w:pPr>
+            <w:r>
+              <w:rPr>
+                <w:b/>
+                <w:bCs/>
+                <w:color w:val="FFFFFF"/>
+                <w:sz w:val="18"/>
+                <w:szCs w:val="18"/>
+              </w:rPr>
+              <w:t xml:space="preserve">How it is done here</w:t>
+            </w:r>
+          </w:p>
+        </w:tc>
+        <w:tc>
+          <w:tcPr>
+            <w:tcW w:type="dxa" w:w="2300"/>
+            <w:tcBorders>
+              <w:top w:val="single" w:color="D9D2C3" w:sz="4"/>
+              <w:left w:val="single" w:color="D9D2C3" w:sz="4"/>
+              <w:bottom w:val="single" w:color="D9D2C3" w:sz="4"/>
+              <w:right w:val="single" w:color="D9D2C3" w:sz="4"/>
+            </w:tcBorders>
+            <w:shd w:fill="681042" w:color="auto" w:val="clear"/>
+            <w:tcMar>
+              <w:top w:type="dxa" w:w="70"/>
+              <w:left w:type="dxa" w:w="100"/>
+              <w:bottom w:type="dxa" w:w="50"/>
+              <w:right w:type="dxa" w:w="100"/>
+            </w:tcMar>
+          </w:tcPr>
+          <w:p>
+            <w:pPr>
+              <w:spacing w:after="40" w:line="252"/>
+            </w:pPr>
+            <w:r>
+              <w:rPr>
+                <w:b/>
+                <w:bCs/>
+                <w:color w:val="FFFFFF"/>
+                <w:sz w:val="18"/>
+                <w:szCs w:val="18"/>
+              </w:rPr>
+              <w:t xml:space="preserve">Test classes</w:t>
+            </w:r>
+          </w:p>
+        </w:tc>
+      </w:tr>
+      <w:tr>
+        <w:trPr>
+          <w:cantSplit/>
+        </w:trPr>
+        <w:tc>
+          <w:tcPr>
+            <w:tcW w:type="dxa" w:w="2200"/>
+            <w:tcBorders>
+              <w:top w:val="single" w:color="D9D2C3" w:sz="4"/>
+              <w:left w:val="single" w:color="D9D2C3" w:sz="4"/>
+              <w:bottom w:val="single" w:color="D9D2C3" w:sz="4"/>
+              <w:right w:val="single" w:color="D9D2C3" w:sz="4"/>
+            </w:tcBorders>
+            <w:tcMar>
+              <w:top w:type="dxa" w:w="70"/>
+              <w:left w:type="dxa" w:w="100"/>
+              <w:bottom w:type="dxa" w:w="50"/>
+              <w:right w:type="dxa" w:w="100"/>
+            </w:tcMar>
+          </w:tcPr>
+          <w:p>
+            <w:pPr>
+              <w:spacing w:after="40" w:line="252"/>
+            </w:pPr>
+            <w:r>
+              <w:rPr>
+                <w:b/>
+                <w:bCs/>
+                <w:sz w:val="18"/>
+                <w:szCs w:val="18"/>
+              </w:rPr>
+              <w:t xml:space="preserve">Unit testing</w:t>
+            </w:r>
+          </w:p>
+        </w:tc>
+        <w:tc>
+          <w:tcPr>
+            <w:tcW w:type="dxa" w:w="1000"/>
+            <w:tcBorders>
+              <w:top w:val="single" w:color="D9D2C3" w:sz="4"/>
+              <w:left w:val="single" w:color="D9D2C3" w:sz="4"/>
+              <w:bottom w:val="single" w:color="D9D2C3" w:sz="4"/>
+              <w:right w:val="single" w:color="D9D2C3" w:sz="4"/>
+            </w:tcBorders>
+            <w:tcMar>
+              <w:top w:type="dxa" w:w="70"/>
+              <w:left w:type="dxa" w:w="100"/>
+              <w:bottom w:type="dxa" w:w="50"/>
+              <w:right w:type="dxa" w:w="100"/>
+            </w:tcMar>
+          </w:tcPr>
+          <w:p>
+            <w:pPr>
+              <w:spacing w:after="40" w:line="252"/>
+            </w:pPr>
+            <w:r>
+              <w:rPr>
+                <w:sz w:val="18"/>
+                <w:szCs w:val="18"/>
+              </w:rPr>
+              <w:t xml:space="preserve">White box</w:t>
+            </w:r>
+          </w:p>
+        </w:tc>
+        <w:tc>
+          <w:tcPr>
+            <w:tcW w:type="dxa" w:w="4138"/>
+            <w:tcBorders>
+              <w:top w:val="single" w:color="D9D2C3" w:sz="4"/>
+              <w:left w:val="single" w:color="D9D2C3" w:sz="4"/>
+              <w:bottom w:val="single" w:color="D9D2C3" w:sz="4"/>
+              <w:right w:val="single" w:color="D9D2C3" w:sz="4"/>
+            </w:tcBorders>
+            <w:tcMar>
+              <w:top w:type="dxa" w:w="70"/>
+              <w:left w:type="dxa" w:w="100"/>
+              <w:bottom w:type="dxa" w:w="50"/>
+              <w:right w:type="dxa" w:w="100"/>
+            </w:tcMar>
+          </w:tcPr>
+          <w:p>
+            <w:pPr>
+              <w:spacing w:after="40" w:line="252"/>
+            </w:pPr>
+            <w:r>
+              <w:rPr>
+                <w:sz w:val="18"/>
+                <w:szCs w:val="18"/>
+              </w:rPr>
+              <w:t xml:space="preserve">One small class is tested alone, with no Spring and no database. We know the code, so we check each branch of the rule.</w:t>
+            </w:r>
+          </w:p>
+        </w:tc>
+        <w:tc>
+          <w:tcPr>
+            <w:tcW w:type="dxa" w:w="2300"/>
+            <w:tcBorders>
+              <w:top w:val="single" w:color="D9D2C3" w:sz="4"/>
+              <w:left w:val="single" w:color="D9D2C3" w:sz="4"/>
+              <w:bottom w:val="single" w:color="D9D2C3" w:sz="4"/>
+              <w:right w:val="single" w:color="D9D2C3" w:sz="4"/>
+            </w:tcBorders>
+            <w:tcMar>
+              <w:top w:type="dxa" w:w="70"/>
+              <w:left w:type="dxa" w:w="100"/>
+              <w:bottom w:type="dxa" w:w="50"/>
+              <w:right w:type="dxa" w:w="100"/>
+            </w:tcMar>
+          </w:tcPr>
+          <w:p>
+            <w:pPr>
+              <w:spacing w:after="40" w:line="252"/>
+            </w:pPr>
+            <w:r>
+              <w:rPr>
+                <w:sz w:val="18"/>
+                <w:szCs w:val="18"/>
+              </w:rPr>
+              <w:t xml:space="preserve">2 classes (see 12.2)</w:t>
+            </w:r>
+          </w:p>
+        </w:tc>
+      </w:tr>
+      <w:tr>
+        <w:trPr>
+          <w:cantSplit/>
+        </w:trPr>
+        <w:tc>
+          <w:tcPr>
+            <w:tcW w:type="dxa" w:w="2200"/>
+            <w:tcBorders>
+              <w:top w:val="single" w:color="D9D2C3" w:sz="4"/>
+              <w:left w:val="single" w:color="D9D2C3" w:sz="4"/>
+              <w:bottom w:val="single" w:color="D9D2C3" w:sz="4"/>
+              <w:right w:val="single" w:color="D9D2C3" w:sz="4"/>
+            </w:tcBorders>
+            <w:shd w:fill="FBF8F1" w:color="auto" w:val="clear"/>
+            <w:tcMar>
+              <w:top w:type="dxa" w:w="70"/>
+              <w:left w:type="dxa" w:w="100"/>
+              <w:bottom w:type="dxa" w:w="50"/>
+              <w:right w:type="dxa" w:w="100"/>
+            </w:tcMar>
+          </w:tcPr>
+          <w:p>
+            <w:pPr>
+              <w:spacing w:after="40" w:line="252"/>
+            </w:pPr>
+            <w:r>
+              <w:rPr>
+                <w:b/>
+                <w:bCs/>
+                <w:sz w:val="18"/>
+                <w:szCs w:val="18"/>
+              </w:rPr>
+              <w:t xml:space="preserve">Controller (component) testing with mocks</w:t>
+            </w:r>
+          </w:p>
+        </w:tc>
+        <w:tc>
+          <w:tcPr>
+            <w:tcW w:type="dxa" w:w="1000"/>
+            <w:tcBorders>
+              <w:top w:val="single" w:color="D9D2C3" w:sz="4"/>
+              <w:left w:val="single" w:color="D9D2C3" w:sz="4"/>
+              <w:bottom w:val="single" w:color="D9D2C3" w:sz="4"/>
+              <w:right w:val="single" w:color="D9D2C3" w:sz="4"/>
+            </w:tcBorders>
+            <w:shd w:fill="FBF8F1" w:color="auto" w:val="clear"/>
+            <w:tcMar>
+              <w:top w:type="dxa" w:w="70"/>
+              <w:left w:type="dxa" w:w="100"/>
+              <w:bottom w:type="dxa" w:w="50"/>
+              <w:right w:type="dxa" w:w="100"/>
+            </w:tcMar>
+          </w:tcPr>
+          <w:p>
+            <w:pPr>
+              <w:spacing w:after="40" w:line="252"/>
+            </w:pPr>
+            <w:r>
+              <w:rPr>
+                <w:sz w:val="18"/>
+                <w:szCs w:val="18"/>
+              </w:rPr>
+              <w:t xml:space="preserve">White box</w:t>
+            </w:r>
+          </w:p>
+        </w:tc>
+        <w:tc>
+          <w:tcPr>
+            <w:tcW w:type="dxa" w:w="4138"/>
+            <w:tcBorders>
+              <w:top w:val="single" w:color="D9D2C3" w:sz="4"/>
+              <w:left w:val="single" w:color="D9D2C3" w:sz="4"/>
+              <w:bottom w:val="single" w:color="D9D2C3" w:sz="4"/>
+              <w:right w:val="single" w:color="D9D2C3" w:sz="4"/>
+            </w:tcBorders>
+            <w:shd w:fill="FBF8F1" w:color="auto" w:val="clear"/>
+            <w:tcMar>
+              <w:top w:type="dxa" w:w="70"/>
+              <w:left w:type="dxa" w:w="100"/>
+              <w:bottom w:type="dxa" w:w="50"/>
+              <w:right w:type="dxa" w:w="100"/>
+            </w:tcMar>
+          </w:tcPr>
+          <w:p>
+            <w:pPr>
+              <w:spacing w:after="40" w:line="252"/>
+            </w:pPr>
+            <w:r>
+              <w:rPr>
+                <w:sz w:val="18"/>
+                <w:szCs w:val="18"/>
+              </w:rPr>
+              <w:t xml:space="preserve">Controllers run inside MockMvc, and the services are replaced by Mockito mocks. It checks routes, redirects, messages, role and token checks, and with </w:t>
+            </w:r>
+            <w:r>
+              <w:rPr>
+                <w:rFonts w:ascii="Consolas" w:cs="Consolas" w:eastAsia="Consolas" w:hAnsi="Consolas"/>
+                <w:color w:val="681042"/>
+                <w:sz w:val="18"/>
+                <w:szCs w:val="18"/>
+              </w:rPr>
+              <w:t xml:space="preserve">verify</w:t>
+            </w:r>
+            <w:r>
+              <w:rPr>
+                <w:sz w:val="18"/>
+                <w:szCs w:val="18"/>
+              </w:rPr>
+              <w:t xml:space="preserve"> that the service was or was not called.</w:t>
+            </w:r>
+          </w:p>
+        </w:tc>
+        <w:tc>
+          <w:tcPr>
+            <w:tcW w:type="dxa" w:w="2300"/>
+            <w:tcBorders>
+              <w:top w:val="single" w:color="D9D2C3" w:sz="4"/>
+              <w:left w:val="single" w:color="D9D2C3" w:sz="4"/>
+              <w:bottom w:val="single" w:color="D9D2C3" w:sz="4"/>
+              <w:right w:val="single" w:color="D9D2C3" w:sz="4"/>
+            </w:tcBorders>
+            <w:shd w:fill="FBF8F1" w:color="auto" w:val="clear"/>
+            <w:tcMar>
+              <w:top w:type="dxa" w:w="70"/>
+              <w:left w:type="dxa" w:w="100"/>
+              <w:bottom w:type="dxa" w:w="50"/>
+              <w:right w:type="dxa" w:w="100"/>
+            </w:tcMar>
+          </w:tcPr>
+          <w:p>
+            <w:pPr>
+              <w:spacing w:after="40" w:line="252"/>
+            </w:pPr>
+            <w:r>
+              <w:rPr>
+                <w:sz w:val="18"/>
+                <w:szCs w:val="18"/>
+              </w:rPr>
+              <w:t xml:space="preserve">1 class (see 12.2)</w:t>
+            </w:r>
+          </w:p>
+        </w:tc>
+      </w:tr>
+      <w:tr>
+        <w:trPr>
+          <w:cantSplit/>
+        </w:trPr>
+        <w:tc>
+          <w:tcPr>
+            <w:tcW w:type="dxa" w:w="2200"/>
+            <w:tcBorders>
+              <w:top w:val="single" w:color="D9D2C3" w:sz="4"/>
+              <w:left w:val="single" w:color="D9D2C3" w:sz="4"/>
+              <w:bottom w:val="single" w:color="D9D2C3" w:sz="4"/>
+              <w:right w:val="single" w:color="D9D2C3" w:sz="4"/>
+            </w:tcBorders>
+            <w:tcMar>
+              <w:top w:type="dxa" w:w="70"/>
+              <w:left w:type="dxa" w:w="100"/>
+              <w:bottom w:type="dxa" w:w="50"/>
+              <w:right w:type="dxa" w:w="100"/>
+            </w:tcMar>
+          </w:tcPr>
+          <w:p>
+            <w:pPr>
+              <w:spacing w:after="40" w:line="252"/>
+            </w:pPr>
+            <w:r>
+              <w:rPr>
+                <w:b/>
+                <w:bCs/>
+                <w:sz w:val="18"/>
+                <w:szCs w:val="18"/>
+              </w:rPr>
+              <w:t xml:space="preserve">Integration testing</w:t>
+            </w:r>
+          </w:p>
+        </w:tc>
+        <w:tc>
+          <w:tcPr>
+            <w:tcW w:type="dxa" w:w="1000"/>
+            <w:tcBorders>
+              <w:top w:val="single" w:color="D9D2C3" w:sz="4"/>
+              <w:left w:val="single" w:color="D9D2C3" w:sz="4"/>
+              <w:bottom w:val="single" w:color="D9D2C3" w:sz="4"/>
+              <w:right w:val="single" w:color="D9D2C3" w:sz="4"/>
+            </w:tcBorders>
+            <w:tcMar>
+              <w:top w:type="dxa" w:w="70"/>
+              <w:left w:type="dxa" w:w="100"/>
+              <w:bottom w:type="dxa" w:w="50"/>
+              <w:right w:type="dxa" w:w="100"/>
+            </w:tcMar>
+          </w:tcPr>
+          <w:p>
+            <w:pPr>
+              <w:spacing w:after="40" w:line="252"/>
+            </w:pPr>
+            <w:r>
+              <w:rPr>
+                <w:sz w:val="18"/>
+                <w:szCs w:val="18"/>
+              </w:rPr>
+              <w:t xml:space="preserve">Grey box</w:t>
+            </w:r>
+          </w:p>
+        </w:tc>
+        <w:tc>
+          <w:tcPr>
+            <w:tcW w:type="dxa" w:w="4138"/>
+            <w:tcBorders>
+              <w:top w:val="single" w:color="D9D2C3" w:sz="4"/>
+              <w:left w:val="single" w:color="D9D2C3" w:sz="4"/>
+              <w:bottom w:val="single" w:color="D9D2C3" w:sz="4"/>
+              <w:right w:val="single" w:color="D9D2C3" w:sz="4"/>
+            </w:tcBorders>
+            <w:tcMar>
+              <w:top w:type="dxa" w:w="70"/>
+              <w:left w:type="dxa" w:w="100"/>
+              <w:bottom w:type="dxa" w:w="50"/>
+              <w:right w:type="dxa" w:w="100"/>
+            </w:tcMar>
+          </w:tcPr>
+          <w:p>
+            <w:pPr>
+              <w:spacing w:after="40" w:line="252"/>
+            </w:pPr>
+            <w:r>
+              <w:rPr>
+                <w:sz w:val="18"/>
+                <w:szCs w:val="18"/>
+              </w:rPr>
+              <w:t xml:space="preserve">The full Spring Boot application starts with the real SQL Server database. A request goes through controller, service, repository and database. The test prepares data through the repositories (it knows the internals) and checks the result through HTTP. Each test is </w:t>
+            </w:r>
+            <w:r>
+              <w:rPr>
+                <w:rFonts w:ascii="Consolas" w:cs="Consolas" w:eastAsia="Consolas" w:hAnsi="Consolas"/>
+                <w:color w:val="681042"/>
+                <w:sz w:val="18"/>
+                <w:szCs w:val="18"/>
+              </w:rPr>
+              <w:t xml:space="preserve">@Transactional</w:t>
+            </w:r>
+            <w:r>
+              <w:rPr>
+                <w:sz w:val="18"/>
+                <w:szCs w:val="18"/>
+              </w:rPr>
+              <w:t xml:space="preserve">, so it rolls back and leaves the data unchanged.</w:t>
+            </w:r>
+          </w:p>
+        </w:tc>
+        <w:tc>
+          <w:tcPr>
+            <w:tcW w:type="dxa" w:w="2300"/>
+            <w:tcBorders>
+              <w:top w:val="single" w:color="D9D2C3" w:sz="4"/>
+              <w:left w:val="single" w:color="D9D2C3" w:sz="4"/>
+              <w:bottom w:val="single" w:color="D9D2C3" w:sz="4"/>
+              <w:right w:val="single" w:color="D9D2C3" w:sz="4"/>
+            </w:tcBorders>
+            <w:tcMar>
+              <w:top w:type="dxa" w:w="70"/>
+              <w:left w:type="dxa" w:w="100"/>
+              <w:bottom w:type="dxa" w:w="50"/>
+              <w:right w:type="dxa" w:w="100"/>
+            </w:tcMar>
+          </w:tcPr>
+          <w:p>
+            <w:pPr>
+              <w:spacing w:after="40" w:line="252"/>
+            </w:pPr>
+            <w:r>
+              <w:rPr>
+                <w:sz w:val="18"/>
+                <w:szCs w:val="18"/>
+              </w:rPr>
+              <w:t xml:space="preserve">3 classes (see 12.2)</w:t>
+            </w:r>
+          </w:p>
+        </w:tc>
+      </w:tr>
+      <w:tr>
+        <w:trPr>
+          <w:cantSplit/>
+        </w:trPr>
+        <w:tc>
+          <w:tcPr>
+            <w:tcW w:type="dxa" w:w="2200"/>
+            <w:tcBorders>
+              <w:top w:val="single" w:color="D9D2C3" w:sz="4"/>
+              <w:left w:val="single" w:color="D9D2C3" w:sz="4"/>
+              <w:bottom w:val="single" w:color="D9D2C3" w:sz="4"/>
+              <w:right w:val="single" w:color="D9D2C3" w:sz="4"/>
+            </w:tcBorders>
+            <w:shd w:fill="FBF8F1" w:color="auto" w:val="clear"/>
+            <w:tcMar>
+              <w:top w:type="dxa" w:w="70"/>
+              <w:left w:type="dxa" w:w="100"/>
+              <w:bottom w:type="dxa" w:w="50"/>
+              <w:right w:type="dxa" w:w="100"/>
+            </w:tcMar>
+          </w:tcPr>
+          <w:p>
+            <w:pPr>
+              <w:spacing w:after="40" w:line="252"/>
+            </w:pPr>
+            <w:r>
+              <w:rPr>
+                <w:b/>
+                <w:bCs/>
+                <w:sz w:val="18"/>
+                <w:szCs w:val="18"/>
+              </w:rPr>
+              <w:t xml:space="preserve">Functional (black box) testing</w:t>
+            </w:r>
+          </w:p>
+        </w:tc>
+        <w:tc>
+          <w:tcPr>
+            <w:tcW w:type="dxa" w:w="1000"/>
+            <w:tcBorders>
+              <w:top w:val="single" w:color="D9D2C3" w:sz="4"/>
+              <w:left w:val="single" w:color="D9D2C3" w:sz="4"/>
+              <w:bottom w:val="single" w:color="D9D2C3" w:sz="4"/>
+              <w:right w:val="single" w:color="D9D2C3" w:sz="4"/>
+            </w:tcBorders>
+            <w:shd w:fill="FBF8F1" w:color="auto" w:val="clear"/>
+            <w:tcMar>
+              <w:top w:type="dxa" w:w="70"/>
+              <w:left w:type="dxa" w:w="100"/>
+              <w:bottom w:type="dxa" w:w="50"/>
+              <w:right w:type="dxa" w:w="100"/>
+            </w:tcMar>
+          </w:tcPr>
+          <w:p>
+            <w:pPr>
+              <w:spacing w:after="40" w:line="252"/>
+            </w:pPr>
+            <w:r>
+              <w:rPr>
+                <w:sz w:val="18"/>
+                <w:szCs w:val="18"/>
+              </w:rPr>
+              <w:t xml:space="preserve">Black box</w:t>
+            </w:r>
+          </w:p>
+        </w:tc>
+        <w:tc>
+          <w:tcPr>
+            <w:tcW w:type="dxa" w:w="4138"/>
+            <w:tcBorders>
+              <w:top w:val="single" w:color="D9D2C3" w:sz="4"/>
+              <w:left w:val="single" w:color="D9D2C3" w:sz="4"/>
+              <w:bottom w:val="single" w:color="D9D2C3" w:sz="4"/>
+              <w:right w:val="single" w:color="D9D2C3" w:sz="4"/>
+            </w:tcBorders>
+            <w:shd w:fill="FBF8F1" w:color="auto" w:val="clear"/>
+            <w:tcMar>
+              <w:top w:type="dxa" w:w="70"/>
+              <w:left w:type="dxa" w:w="100"/>
+              <w:bottom w:type="dxa" w:w="50"/>
+              <w:right w:type="dxa" w:w="100"/>
+            </w:tcMar>
+          </w:tcPr>
+          <w:p>
+            <w:pPr>
+              <w:spacing w:after="40" w:line="252"/>
+            </w:pPr>
+            <w:r>
+              <w:rPr>
+                <w:sz w:val="18"/>
+                <w:szCs w:val="18"/>
+              </w:rPr>
+              <w:t xml:space="preserve">The integration tests send HTTP requests and check only what a user would see: the page, the redirect, the message and the saved data. They do not depend on how the code is written inside.</w:t>
+            </w:r>
+          </w:p>
+        </w:tc>
+        <w:tc>
+          <w:tcPr>
+            <w:tcW w:type="dxa" w:w="2300"/>
+            <w:tcBorders>
+              <w:top w:val="single" w:color="D9D2C3" w:sz="4"/>
+              <w:left w:val="single" w:color="D9D2C3" w:sz="4"/>
+              <w:bottom w:val="single" w:color="D9D2C3" w:sz="4"/>
+              <w:right w:val="single" w:color="D9D2C3" w:sz="4"/>
+            </w:tcBorders>
+            <w:shd w:fill="FBF8F1" w:color="auto" w:val="clear"/>
+            <w:tcMar>
+              <w:top w:type="dxa" w:w="70"/>
+              <w:left w:type="dxa" w:w="100"/>
+              <w:bottom w:type="dxa" w:w="50"/>
+              <w:right w:type="dxa" w:w="100"/>
+            </w:tcMar>
+          </w:tcPr>
+          <w:p>
+            <w:pPr>
+              <w:spacing w:after="40" w:line="252"/>
+            </w:pPr>
+            <w:r>
+              <w:rPr>
+                <w:sz w:val="18"/>
+                <w:szCs w:val="18"/>
+              </w:rPr>
+              <w:t xml:space="preserve">same 3 classes</w:t>
+            </w:r>
+          </w:p>
+        </w:tc>
+      </w:tr>
+      <w:tr>
+        <w:trPr>
+          <w:cantSplit/>
+        </w:trPr>
+        <w:tc>
+          <w:tcPr>
+            <w:tcW w:type="dxa" w:w="2200"/>
+            <w:tcBorders>
+              <w:top w:val="single" w:color="D9D2C3" w:sz="4"/>
+              <w:left w:val="single" w:color="D9D2C3" w:sz="4"/>
+              <w:bottom w:val="single" w:color="D9D2C3" w:sz="4"/>
+              <w:right w:val="single" w:color="D9D2C3" w:sz="4"/>
+            </w:tcBorders>
+            <w:tcMar>
+              <w:top w:type="dxa" w:w="70"/>
+              <w:left w:type="dxa" w:w="100"/>
+              <w:bottom w:type="dxa" w:w="50"/>
+              <w:right w:type="dxa" w:w="100"/>
+            </w:tcMar>
+          </w:tcPr>
+          <w:p>
+            <w:pPr>
+              <w:spacing w:after="40" w:line="252"/>
+            </w:pPr>
+            <w:r>
+              <w:rPr>
+                <w:b/>
+                <w:bCs/>
+                <w:sz w:val="18"/>
+                <w:szCs w:val="18"/>
+              </w:rPr>
+              <w:t xml:space="preserve">Boundary value and equivalence testing</w:t>
+            </w:r>
+          </w:p>
+        </w:tc>
+        <w:tc>
+          <w:tcPr>
+            <w:tcW w:type="dxa" w:w="1000"/>
+            <w:tcBorders>
+              <w:top w:val="single" w:color="D9D2C3" w:sz="4"/>
+              <w:left w:val="single" w:color="D9D2C3" w:sz="4"/>
+              <w:bottom w:val="single" w:color="D9D2C3" w:sz="4"/>
+              <w:right w:val="single" w:color="D9D2C3" w:sz="4"/>
+            </w:tcBorders>
+            <w:tcMar>
+              <w:top w:type="dxa" w:w="70"/>
+              <w:left w:type="dxa" w:w="100"/>
+              <w:bottom w:type="dxa" w:w="50"/>
+              <w:right w:type="dxa" w:w="100"/>
+            </w:tcMar>
+          </w:tcPr>
+          <w:p>
+            <w:pPr>
+              <w:spacing w:after="40" w:line="252"/>
+            </w:pPr>
+            <w:r>
+              <w:rPr>
+                <w:sz w:val="18"/>
+                <w:szCs w:val="18"/>
+              </w:rPr>
+              <w:t xml:space="preserve">Black box</w:t>
+            </w:r>
+          </w:p>
+        </w:tc>
+        <w:tc>
+          <w:tcPr>
+            <w:tcW w:type="dxa" w:w="4138"/>
+            <w:tcBorders>
+              <w:top w:val="single" w:color="D9D2C3" w:sz="4"/>
+              <w:left w:val="single" w:color="D9D2C3" w:sz="4"/>
+              <w:bottom w:val="single" w:color="D9D2C3" w:sz="4"/>
+              <w:right w:val="single" w:color="D9D2C3" w:sz="4"/>
+            </w:tcBorders>
+            <w:tcMar>
+              <w:top w:type="dxa" w:w="70"/>
+              <w:left w:type="dxa" w:w="100"/>
+              <w:bottom w:type="dxa" w:w="50"/>
+              <w:right w:type="dxa" w:w="100"/>
+            </w:tcMar>
+          </w:tcPr>
+          <w:p>
+            <w:pPr>
+              <w:spacing w:after="40" w:line="252"/>
+            </w:pPr>
+            <w:r>
+              <w:rPr>
+                <w:sz w:val="18"/>
+                <w:szCs w:val="18"/>
+              </w:rPr>
+              <w:t xml:space="preserve">Boundary: cancelling exactly 72 hours before is allowed. Equivalence classes: a valid slot against a full, past, other-centre and other-service slot.</w:t>
+            </w:r>
+          </w:p>
+        </w:tc>
+        <w:tc>
+          <w:tcPr>
+            <w:tcW w:type="dxa" w:w="2300"/>
+            <w:tcBorders>
+              <w:top w:val="single" w:color="D9D2C3" w:sz="4"/>
+              <w:left w:val="single" w:color="D9D2C3" w:sz="4"/>
+              <w:bottom w:val="single" w:color="D9D2C3" w:sz="4"/>
+              <w:right w:val="single" w:color="D9D2C3" w:sz="4"/>
+            </w:tcBorders>
+            <w:tcMar>
+              <w:top w:type="dxa" w:w="70"/>
+              <w:left w:type="dxa" w:w="100"/>
+              <w:bottom w:type="dxa" w:w="50"/>
+              <w:right w:type="dxa" w:w="100"/>
+            </w:tcMar>
+          </w:tcPr>
+          <w:p>
+            <w:pPr>
+              <w:spacing w:after="40" w:line="252"/>
+            </w:pPr>
+            <w:r>
+              <w:rPr>
+                <w:sz w:val="18"/>
+                <w:szCs w:val="18"/>
+              </w:rPr>
+              <w:t xml:space="preserve">policy and workflow tests</w:t>
+            </w:r>
+          </w:p>
+        </w:tc>
+      </w:tr>
+      <w:tr>
+        <w:trPr>
+          <w:cantSplit/>
+        </w:trPr>
+        <w:tc>
+          <w:tcPr>
+            <w:tcW w:type="dxa" w:w="2200"/>
+            <w:tcBorders>
+              <w:top w:val="single" w:color="D9D2C3" w:sz="4"/>
+              <w:left w:val="single" w:color="D9D2C3" w:sz="4"/>
+              <w:bottom w:val="single" w:color="D9D2C3" w:sz="4"/>
+              <w:right w:val="single" w:color="D9D2C3" w:sz="4"/>
+            </w:tcBorders>
+            <w:shd w:fill="FBF8F1" w:color="auto" w:val="clear"/>
+            <w:tcMar>
+              <w:top w:type="dxa" w:w="70"/>
+              <w:left w:type="dxa" w:w="100"/>
+              <w:bottom w:type="dxa" w:w="50"/>
+              <w:right w:type="dxa" w:w="100"/>
+            </w:tcMar>
+          </w:tcPr>
+          <w:p>
+            <w:pPr>
+              <w:spacing w:after="40" w:line="252"/>
+            </w:pPr>
+            <w:r>
+              <w:rPr>
+                <w:b/>
+                <w:bCs/>
+                <w:sz w:val="18"/>
+                <w:szCs w:val="18"/>
+              </w:rPr>
+              <w:t xml:space="preserve">Negative and security testing</w:t>
+            </w:r>
+          </w:p>
+        </w:tc>
+        <w:tc>
+          <w:tcPr>
+            <w:tcW w:type="dxa" w:w="1000"/>
+            <w:tcBorders>
+              <w:top w:val="single" w:color="D9D2C3" w:sz="4"/>
+              <w:left w:val="single" w:color="D9D2C3" w:sz="4"/>
+              <w:bottom w:val="single" w:color="D9D2C3" w:sz="4"/>
+              <w:right w:val="single" w:color="D9D2C3" w:sz="4"/>
+            </w:tcBorders>
+            <w:shd w:fill="FBF8F1" w:color="auto" w:val="clear"/>
+            <w:tcMar>
+              <w:top w:type="dxa" w:w="70"/>
+              <w:left w:type="dxa" w:w="100"/>
+              <w:bottom w:type="dxa" w:w="50"/>
+              <w:right w:type="dxa" w:w="100"/>
+            </w:tcMar>
+          </w:tcPr>
+          <w:p>
+            <w:pPr>
+              <w:spacing w:after="40" w:line="252"/>
+            </w:pPr>
+            <w:r>
+              <w:rPr>
+                <w:sz w:val="18"/>
+                <w:szCs w:val="18"/>
+              </w:rPr>
+              <w:t xml:space="preserve">Black box</w:t>
+            </w:r>
+          </w:p>
+        </w:tc>
+        <w:tc>
+          <w:tcPr>
+            <w:tcW w:type="dxa" w:w="4138"/>
+            <w:tcBorders>
+              <w:top w:val="single" w:color="D9D2C3" w:sz="4"/>
+              <w:left w:val="single" w:color="D9D2C3" w:sz="4"/>
+              <w:bottom w:val="single" w:color="D9D2C3" w:sz="4"/>
+              <w:right w:val="single" w:color="D9D2C3" w:sz="4"/>
+            </w:tcBorders>
+            <w:shd w:fill="FBF8F1" w:color="auto" w:val="clear"/>
+            <w:tcMar>
+              <w:top w:type="dxa" w:w="70"/>
+              <w:left w:type="dxa" w:w="100"/>
+              <w:bottom w:type="dxa" w:w="50"/>
+              <w:right w:type="dxa" w:w="100"/>
+            </w:tcMar>
+          </w:tcPr>
+          <w:p>
+            <w:pPr>
+              <w:spacing w:after="40" w:line="252"/>
+            </w:pPr>
+            <w:r>
+              <w:rPr>
+                <w:sz w:val="18"/>
+                <w:szCs w:val="18"/>
+              </w:rPr>
+              <w:t xml:space="preserve">Forged or missing form token, wrong owner, wrong officer role, unknown service in the URL, stale form, database error. The system must refuse safely with a clear message.</w:t>
+            </w:r>
+          </w:p>
+        </w:tc>
+        <w:tc>
+          <w:tcPr>
+            <w:tcW w:type="dxa" w:w="2300"/>
+            <w:tcBorders>
+              <w:top w:val="single" w:color="D9D2C3" w:sz="4"/>
+              <w:left w:val="single" w:color="D9D2C3" w:sz="4"/>
+              <w:bottom w:val="single" w:color="D9D2C3" w:sz="4"/>
+              <w:right w:val="single" w:color="D9D2C3" w:sz="4"/>
+            </w:tcBorders>
+            <w:shd w:fill="FBF8F1" w:color="auto" w:val="clear"/>
+            <w:tcMar>
+              <w:top w:type="dxa" w:w="70"/>
+              <w:left w:type="dxa" w:w="100"/>
+              <w:bottom w:type="dxa" w:w="50"/>
+              <w:right w:type="dxa" w:w="100"/>
+            </w:tcMar>
+          </w:tcPr>
+          <w:p>
+            <w:pPr>
+              <w:spacing w:after="40" w:line="252"/>
+            </w:pPr>
+            <w:r>
+              <w:rPr>
+                <w:sz w:val="18"/>
+                <w:szCs w:val="18"/>
+              </w:rPr>
+              <w:t xml:space="preserve">controller and workflow tests</w:t>
+            </w:r>
+          </w:p>
+        </w:tc>
+      </w:tr>
+      <w:tr>
+        <w:trPr>
+          <w:cantSplit/>
+        </w:trPr>
+        <w:tc>
+          <w:tcPr>
+            <w:tcW w:type="dxa" w:w="2200"/>
+            <w:tcBorders>
+              <w:top w:val="single" w:color="D9D2C3" w:sz="4"/>
+              <w:left w:val="single" w:color="D9D2C3" w:sz="4"/>
+              <w:bottom w:val="single" w:color="D9D2C3" w:sz="4"/>
+              <w:right w:val="single" w:color="D9D2C3" w:sz="4"/>
+            </w:tcBorders>
+            <w:tcMar>
+              <w:top w:type="dxa" w:w="70"/>
+              <w:left w:type="dxa" w:w="100"/>
+              <w:bottom w:type="dxa" w:w="50"/>
+              <w:right w:type="dxa" w:w="100"/>
+            </w:tcMar>
+          </w:tcPr>
+          <w:p>
+            <w:pPr>
+              <w:spacing w:after="40" w:line="252"/>
+            </w:pPr>
+            <w:r>
+              <w:rPr>
+                <w:b/>
+                <w:bCs/>
+                <w:sz w:val="18"/>
+                <w:szCs w:val="18"/>
+              </w:rPr>
+              <w:t xml:space="preserve">Regression testing</w:t>
+            </w:r>
+          </w:p>
+        </w:tc>
+        <w:tc>
+          <w:tcPr>
+            <w:tcW w:type="dxa" w:w="1000"/>
+            <w:tcBorders>
+              <w:top w:val="single" w:color="D9D2C3" w:sz="4"/>
+              <w:left w:val="single" w:color="D9D2C3" w:sz="4"/>
+              <w:bottom w:val="single" w:color="D9D2C3" w:sz="4"/>
+              <w:right w:val="single" w:color="D9D2C3" w:sz="4"/>
+            </w:tcBorders>
+            <w:tcMar>
+              <w:top w:type="dxa" w:w="70"/>
+              <w:left w:type="dxa" w:w="100"/>
+              <w:bottom w:type="dxa" w:w="50"/>
+              <w:right w:type="dxa" w:w="100"/>
+            </w:tcMar>
+          </w:tcPr>
+          <w:p>
+            <w:pPr>
+              <w:spacing w:after="40" w:line="252"/>
+            </w:pPr>
+            <w:r>
+              <w:rPr>
+                <w:sz w:val="18"/>
+                <w:szCs w:val="18"/>
+              </w:rPr>
+              <w:t xml:space="preserve">Both</w:t>
+            </w:r>
+          </w:p>
+        </w:tc>
+        <w:tc>
+          <w:tcPr>
+            <w:tcW w:type="dxa" w:w="4138"/>
+            <w:tcBorders>
+              <w:top w:val="single" w:color="D9D2C3" w:sz="4"/>
+              <w:left w:val="single" w:color="D9D2C3" w:sz="4"/>
+              <w:bottom w:val="single" w:color="D9D2C3" w:sz="4"/>
+              <w:right w:val="single" w:color="D9D2C3" w:sz="4"/>
+            </w:tcBorders>
+            <w:tcMar>
+              <w:top w:type="dxa" w:w="70"/>
+              <w:left w:type="dxa" w:w="100"/>
+              <w:bottom w:type="dxa" w:w="50"/>
+              <w:right w:type="dxa" w:w="100"/>
+            </w:tcMar>
+          </w:tcPr>
+          <w:p>
+            <w:pPr>
+              <w:spacing w:after="40" w:line="252"/>
+            </w:pPr>
+            <w:r>
+              <w:rPr>
+                <w:sz w:val="18"/>
+                <w:szCs w:val="18"/>
+              </w:rPr>
+              <w:t xml:space="preserve">The same suites were run again after teammates changed the module (missed-booking reschedule, expired pass, new Observer). All still pass.</w:t>
+            </w:r>
+          </w:p>
+        </w:tc>
+        <w:tc>
+          <w:tcPr>
+            <w:tcW w:type="dxa" w:w="2300"/>
+            <w:tcBorders>
+              <w:top w:val="single" w:color="D9D2C3" w:sz="4"/>
+              <w:left w:val="single" w:color="D9D2C3" w:sz="4"/>
+              <w:bottom w:val="single" w:color="D9D2C3" w:sz="4"/>
+              <w:right w:val="single" w:color="D9D2C3" w:sz="4"/>
+            </w:tcBorders>
+            <w:tcMar>
+              <w:top w:type="dxa" w:w="70"/>
+              <w:left w:type="dxa" w:w="100"/>
+              <w:bottom w:type="dxa" w:w="50"/>
+              <w:right w:type="dxa" w:w="100"/>
+            </w:tcMar>
+          </w:tcPr>
+          <w:p>
+            <w:pPr>
+              <w:spacing w:after="40" w:line="252"/>
+            </w:pPr>
+            <w:r>
+              <w:rPr>
+                <w:sz w:val="18"/>
+                <w:szCs w:val="18"/>
+              </w:rPr>
+              <w:t xml:space="preserve">all of the above</w:t>
+            </w:r>
+          </w:p>
+        </w:tc>
+      </w:tr>
+      <w:tr>
+        <w:trPr>
+          <w:cantSplit/>
+        </w:trPr>
+        <w:tc>
+          <w:tcPr>
+            <w:tcW w:type="dxa" w:w="2200"/>
+            <w:tcBorders>
+              <w:top w:val="single" w:color="D9D2C3" w:sz="4"/>
+              <w:left w:val="single" w:color="D9D2C3" w:sz="4"/>
+              <w:bottom w:val="single" w:color="D9D2C3" w:sz="4"/>
+              <w:right w:val="single" w:color="D9D2C3" w:sz="4"/>
+            </w:tcBorders>
+            <w:shd w:fill="FBF8F1" w:color="auto" w:val="clear"/>
+            <w:tcMar>
+              <w:top w:type="dxa" w:w="70"/>
+              <w:left w:type="dxa" w:w="100"/>
+              <w:bottom w:type="dxa" w:w="50"/>
+              <w:right w:type="dxa" w:w="100"/>
+            </w:tcMar>
+          </w:tcPr>
+          <w:p>
+            <w:pPr>
+              <w:spacing w:after="40" w:line="252"/>
+            </w:pPr>
+            <w:r>
+              <w:rPr>
+                <w:b/>
+                <w:bCs/>
+                <w:sz w:val="18"/>
+                <w:szCs w:val="18"/>
+              </w:rPr>
+              <w:t xml:space="preserve">Manual (system) testing</w:t>
+            </w:r>
+          </w:p>
+        </w:tc>
+        <w:tc>
+          <w:tcPr>
+            <w:tcW w:type="dxa" w:w="1000"/>
+            <w:tcBorders>
+              <w:top w:val="single" w:color="D9D2C3" w:sz="4"/>
+              <w:left w:val="single" w:color="D9D2C3" w:sz="4"/>
+              <w:bottom w:val="single" w:color="D9D2C3" w:sz="4"/>
+              <w:right w:val="single" w:color="D9D2C3" w:sz="4"/>
+            </w:tcBorders>
+            <w:shd w:fill="FBF8F1" w:color="auto" w:val="clear"/>
+            <w:tcMar>
+              <w:top w:type="dxa" w:w="70"/>
+              <w:left w:type="dxa" w:w="100"/>
+              <w:bottom w:type="dxa" w:w="50"/>
+              <w:right w:type="dxa" w:w="100"/>
+            </w:tcMar>
+          </w:tcPr>
+          <w:p>
+            <w:pPr>
+              <w:spacing w:after="40" w:line="252"/>
+            </w:pPr>
+            <w:r>
+              <w:rPr>
+                <w:sz w:val="18"/>
+                <w:szCs w:val="18"/>
+              </w:rPr>
+              <w:t xml:space="preserve">Black box</w:t>
+            </w:r>
+          </w:p>
+        </w:tc>
+        <w:tc>
+          <w:tcPr>
+            <w:tcW w:type="dxa" w:w="4138"/>
+            <w:tcBorders>
+              <w:top w:val="single" w:color="D9D2C3" w:sz="4"/>
+              <w:left w:val="single" w:color="D9D2C3" w:sz="4"/>
+              <w:bottom w:val="single" w:color="D9D2C3" w:sz="4"/>
+              <w:right w:val="single" w:color="D9D2C3" w:sz="4"/>
+            </w:tcBorders>
+            <w:shd w:fill="FBF8F1" w:color="auto" w:val="clear"/>
+            <w:tcMar>
+              <w:top w:type="dxa" w:w="70"/>
+              <w:left w:type="dxa" w:w="100"/>
+              <w:bottom w:type="dxa" w:w="50"/>
+              <w:right w:type="dxa" w:w="100"/>
+            </w:tcMar>
+          </w:tcPr>
+          <w:p>
+            <w:pPr>
+              <w:spacing w:after="40" w:line="252"/>
+            </w:pPr>
+            <w:r>
+              <w:rPr>
+                <w:sz w:val="18"/>
+                <w:szCs w:val="18"/>
+              </w:rPr>
+              <w:t xml:space="preserve">Follow the demo script in section 13 in the browser. This is how the calendar, the webcam QR scanner and the page layout are checked.</w:t>
+            </w:r>
+          </w:p>
+        </w:tc>
+        <w:tc>
+          <w:tcPr>
+            <w:tcW w:type="dxa" w:w="2300"/>
+            <w:tcBorders>
+              <w:top w:val="single" w:color="D9D2C3" w:sz="4"/>
+              <w:left w:val="single" w:color="D9D2C3" w:sz="4"/>
+              <w:bottom w:val="single" w:color="D9D2C3" w:sz="4"/>
+              <w:right w:val="single" w:color="D9D2C3" w:sz="4"/>
+            </w:tcBorders>
+            <w:shd w:fill="FBF8F1" w:color="auto" w:val="clear"/>
+            <w:tcMar>
+              <w:top w:type="dxa" w:w="70"/>
+              <w:left w:type="dxa" w:w="100"/>
+              <w:bottom w:type="dxa" w:w="50"/>
+              <w:right w:type="dxa" w:w="100"/>
+            </w:tcMar>
+          </w:tcPr>
+          <w:p>
+            <w:pPr>
+              <w:spacing w:after="40" w:line="252"/>
+            </w:pPr>
+            <w:r>
+              <w:rPr>
+                <w:sz w:val="18"/>
+                <w:szCs w:val="18"/>
+              </w:rPr>
+              <w:t xml:space="preserve">demo script</w:t>
+            </w:r>
+          </w:p>
+        </w:tc>
+      </w:tr>
+    </w:tbl>
+    <w:p>
+      <w:pPr>
+        <w:spacing w:after="100" w:line="276"/>
+      </w:pPr>
+      <w:r>
+        <w:t xml:space="preserve">Not covered by automated tests (say this honestly if asked): performance and load testing, automated browser (UI) testing, and two people booking the last place at the exact same moment. That case is protected by database locks (section 9) but is only checked by reading the code.</w:t>
+      </w:r>
+    </w:p>
+    <w:p>
+      <w:pPr>
+        <w:spacing w:after="120"/>
+      </w:pPr>
+    </w:p>
+    <w:p>
+      <w:pPr>
+        <w:pStyle w:val="Heading2"/>
+        <w:keepNext/>
+      </w:pPr>
+      <w:r>
+        <w:t xml:space="preserve">12.2 Test classes</w:t>
       </w:r>
     </w:p>
     <w:tbl>
@@ -12007,8 +13246,9 @@
       </w:tblPr>
       <w:tblGrid>
         <w:gridCol w:w="4500"/>
-        <w:gridCol w:w="800"/>
-        <w:gridCol w:w="4338"/>
+        <w:gridCol w:w="1250"/>
+        <w:gridCol w:w="600"/>
+        <w:gridCol w:w="3288"/>
       </w:tblGrid>
       <w:tr>
         <w:trPr>
@@ -12050,7 +13290,7 @@
         </w:tc>
         <w:tc>
           <w:tcPr>
-            <w:tcW w:type="dxa" w:w="800"/>
+            <w:tcW w:type="dxa" w:w="1250"/>
             <w:tcBorders>
               <w:top w:val="single" w:color="D9D2C3" w:sz="4"/>
               <w:left w:val="single" w:color="D9D2C3" w:sz="4"/>
@@ -12077,13 +13317,13 @@
                 <w:sz w:val="18"/>
                 <w:szCs w:val="18"/>
               </w:rPr>
-              <w:t xml:space="preserve">Tests</w:t>
-            </w:r>
-          </w:p>
-        </w:tc>
-        <w:tc>
-          <w:tcPr>
-            <w:tcW w:type="dxa" w:w="4338"/>
+              <w:t xml:space="preserve">Type</w:t>
+            </w:r>
+          </w:p>
+        </w:tc>
+        <w:tc>
+          <w:tcPr>
+            <w:tcW w:type="dxa" w:w="600"/>
             <w:tcBorders>
               <w:top w:val="single" w:color="D9D2C3" w:sz="4"/>
               <w:left w:val="single" w:color="D9D2C3" w:sz="4"/>
@@ -12110,7 +13350,40 @@
                 <w:sz w:val="18"/>
                 <w:szCs w:val="18"/>
               </w:rPr>
-              <w:t xml:space="preserve">Covers</w:t>
+              <w:t xml:space="preserve">Tests</w:t>
+            </w:r>
+          </w:p>
+        </w:tc>
+        <w:tc>
+          <w:tcPr>
+            <w:tcW w:type="dxa" w:w="3288"/>
+            <w:tcBorders>
+              <w:top w:val="single" w:color="D9D2C3" w:sz="4"/>
+              <w:left w:val="single" w:color="D9D2C3" w:sz="4"/>
+              <w:bottom w:val="single" w:color="D9D2C3" w:sz="4"/>
+              <w:right w:val="single" w:color="D9D2C3" w:sz="4"/>
+            </w:tcBorders>
+            <w:shd w:fill="681042" w:color="auto" w:val="clear"/>
+            <w:tcMar>
+              <w:top w:type="dxa" w:w="70"/>
+              <w:left w:type="dxa" w:w="100"/>
+              <w:bottom w:type="dxa" w:w="50"/>
+              <w:right w:type="dxa" w:w="100"/>
+            </w:tcMar>
+          </w:tcPr>
+          <w:p>
+            <w:pPr>
+              <w:spacing w:after="40" w:line="252"/>
+            </w:pPr>
+            <w:r>
+              <w:rPr>
+                <w:b/>
+                <w:bCs/>
+                <w:color w:val="FFFFFF"/>
+                <w:sz w:val="18"/>
+                <w:szCs w:val="18"/>
+              </w:rPr>
+              <w:t xml:space="preserve">What it checks</w:t>
             </w:r>
           </w:p>
         </w:tc>
@@ -12152,7 +13425,36 @@
         </w:tc>
         <w:tc>
           <w:tcPr>
-            <w:tcW w:type="dxa" w:w="800"/>
+            <w:tcW w:type="dxa" w:w="1250"/>
+            <w:tcBorders>
+              <w:top w:val="single" w:color="D9D2C3" w:sz="4"/>
+              <w:left w:val="single" w:color="D9D2C3" w:sz="4"/>
+              <w:bottom w:val="single" w:color="D9D2C3" w:sz="4"/>
+              <w:right w:val="single" w:color="D9D2C3" w:sz="4"/>
+            </w:tcBorders>
+            <w:tcMar>
+              <w:top w:type="dxa" w:w="70"/>
+              <w:left w:type="dxa" w:w="100"/>
+              <w:bottom w:type="dxa" w:w="50"/>
+              <w:right w:type="dxa" w:w="100"/>
+            </w:tcMar>
+          </w:tcPr>
+          <w:p>
+            <w:pPr>
+              <w:spacing w:after="40" w:line="252"/>
+            </w:pPr>
+            <w:r>
+              <w:rPr>
+                <w:sz w:val="18"/>
+                <w:szCs w:val="18"/>
+              </w:rPr>
+              <w:t xml:space="preserve">Unit</w:t>
+            </w:r>
+          </w:p>
+        </w:tc>
+        <w:tc>
+          <w:tcPr>
+            <w:tcW w:type="dxa" w:w="600"/>
             <w:tcBorders>
               <w:top w:val="single" w:color="D9D2C3" w:sz="4"/>
               <w:left w:val="single" w:color="D9D2C3" w:sz="4"/>
@@ -12181,7 +13483,7 @@
         </w:tc>
         <w:tc>
           <w:tcPr>
-            <w:tcW w:type="dxa" w:w="4338"/>
+            <w:tcW w:type="dxa" w:w="3288"/>
             <w:tcBorders>
               <w:top w:val="single" w:color="D9D2C3" w:sz="4"/>
               <w:left w:val="single" w:color="D9D2C3" w:sz="4"/>
@@ -12241,13 +13543,13 @@
                 <w:sz w:val="18"/>
                 <w:szCs w:val="18"/>
               </w:rPr>
-              <w:t xml:space="preserve">BiometricOfficerControllerTests</w:t>
-            </w:r>
-          </w:p>
-        </w:tc>
-        <w:tc>
-          <w:tcPr>
-            <w:tcW w:type="dxa" w:w="800"/>
+              <w:t xml:space="preserve">AppointmentPassServiceTests</w:t>
+            </w:r>
+          </w:p>
+        </w:tc>
+        <w:tc>
+          <w:tcPr>
+            <w:tcW w:type="dxa" w:w="1250"/>
             <w:tcBorders>
               <w:top w:val="single" w:color="D9D2C3" w:sz="4"/>
               <w:left w:val="single" w:color="D9D2C3" w:sz="4"/>
@@ -12271,13 +13573,13 @@
                 <w:sz w:val="18"/>
                 <w:szCs w:val="18"/>
               </w:rPr>
-              <w:t xml:space="preserve">13</w:t>
-            </w:r>
-          </w:p>
-        </w:tc>
-        <w:tc>
-          <w:tcPr>
-            <w:tcW w:type="dxa" w:w="4338"/>
+              <w:t xml:space="preserve">Unit</w:t>
+            </w:r>
+          </w:p>
+        </w:tc>
+        <w:tc>
+          <w:tcPr>
+            <w:tcW w:type="dxa" w:w="600"/>
             <w:tcBorders>
               <w:top w:val="single" w:color="D9D2C3" w:sz="4"/>
               <w:left w:val="single" w:color="D9D2C3" w:sz="4"/>
@@ -12301,7 +13603,37 @@
                 <w:sz w:val="18"/>
                 <w:szCs w:val="18"/>
               </w:rPr>
-              <w:t xml:space="preserve">Officer routes, role access, form tokens, database-error messages, unknown service gives 404</w:t>
+              <w:t xml:space="preserve">1</w:t>
+            </w:r>
+          </w:p>
+        </w:tc>
+        <w:tc>
+          <w:tcPr>
+            <w:tcW w:type="dxa" w:w="3288"/>
+            <w:tcBorders>
+              <w:top w:val="single" w:color="D9D2C3" w:sz="4"/>
+              <w:left w:val="single" w:color="D9D2C3" w:sz="4"/>
+              <w:bottom w:val="single" w:color="D9D2C3" w:sz="4"/>
+              <w:right w:val="single" w:color="D9D2C3" w:sz="4"/>
+            </w:tcBorders>
+            <w:shd w:fill="FBF8F1" w:color="auto" w:val="clear"/>
+            <w:tcMar>
+              <w:top w:type="dxa" w:w="70"/>
+              <w:left w:type="dxa" w:w="100"/>
+              <w:bottom w:type="dxa" w:w="50"/>
+              <w:right w:type="dxa" w:w="100"/>
+            </w:tcMar>
+          </w:tcPr>
+          <w:p>
+            <w:pPr>
+              <w:spacing w:after="40" w:line="252"/>
+            </w:pPr>
+            <w:r>
+              <w:rPr>
+                <w:sz w:val="18"/>
+                <w:szCs w:val="18"/>
+              </w:rPr>
+              <w:t xml:space="preserve">Pass image theme and QR size for NIC and passport</w:t>
             </w:r>
           </w:p>
         </w:tc>
@@ -12337,65 +13669,94 @@
                 <w:sz w:val="18"/>
                 <w:szCs w:val="18"/>
               </w:rPr>
-              <w:t xml:space="preserve">AppointmentPassServiceTests</w:t>
-            </w:r>
-          </w:p>
-        </w:tc>
-        <w:tc>
-          <w:tcPr>
-            <w:tcW w:type="dxa" w:w="800"/>
-            <w:tcBorders>
-              <w:top w:val="single" w:color="D9D2C3" w:sz="4"/>
-              <w:left w:val="single" w:color="D9D2C3" w:sz="4"/>
-              <w:bottom w:val="single" w:color="D9D2C3" w:sz="4"/>
-              <w:right w:val="single" w:color="D9D2C3" w:sz="4"/>
-            </w:tcBorders>
-            <w:tcMar>
-              <w:top w:type="dxa" w:w="70"/>
-              <w:left w:type="dxa" w:w="100"/>
-              <w:bottom w:type="dxa" w:w="50"/>
-              <w:right w:type="dxa" w:w="100"/>
-            </w:tcMar>
-          </w:tcPr>
-          <w:p>
-            <w:pPr>
-              <w:spacing w:after="40" w:line="252"/>
-            </w:pPr>
-            <w:r>
-              <w:rPr>
-                <w:sz w:val="18"/>
-                <w:szCs w:val="18"/>
-              </w:rPr>
-              <w:t xml:space="preserve">1</w:t>
-            </w:r>
-          </w:p>
-        </w:tc>
-        <w:tc>
-          <w:tcPr>
-            <w:tcW w:type="dxa" w:w="4338"/>
-            <w:tcBorders>
-              <w:top w:val="single" w:color="D9D2C3" w:sz="4"/>
-              <w:left w:val="single" w:color="D9D2C3" w:sz="4"/>
-              <w:bottom w:val="single" w:color="D9D2C3" w:sz="4"/>
-              <w:right w:val="single" w:color="D9D2C3" w:sz="4"/>
-            </w:tcBorders>
-            <w:tcMar>
-              <w:top w:type="dxa" w:w="70"/>
-              <w:left w:type="dxa" w:w="100"/>
-              <w:bottom w:type="dxa" w:w="50"/>
-              <w:right w:type="dxa" w:w="100"/>
-            </w:tcMar>
-          </w:tcPr>
-          <w:p>
-            <w:pPr>
-              <w:spacing w:after="40" w:line="252"/>
-            </w:pPr>
-            <w:r>
-              <w:rPr>
-                <w:sz w:val="18"/>
-                <w:szCs w:val="18"/>
-              </w:rPr>
-              <w:t xml:space="preserve">Pass image theme and QR size for NIC and passport</w:t>
+              <w:t xml:space="preserve">BiometricOfficerControllerTests</w:t>
+            </w:r>
+          </w:p>
+        </w:tc>
+        <w:tc>
+          <w:tcPr>
+            <w:tcW w:type="dxa" w:w="1250"/>
+            <w:tcBorders>
+              <w:top w:val="single" w:color="D9D2C3" w:sz="4"/>
+              <w:left w:val="single" w:color="D9D2C3" w:sz="4"/>
+              <w:bottom w:val="single" w:color="D9D2C3" w:sz="4"/>
+              <w:right w:val="single" w:color="D9D2C3" w:sz="4"/>
+            </w:tcBorders>
+            <w:tcMar>
+              <w:top w:type="dxa" w:w="70"/>
+              <w:left w:type="dxa" w:w="100"/>
+              <w:bottom w:type="dxa" w:w="50"/>
+              <w:right w:type="dxa" w:w="100"/>
+            </w:tcMar>
+          </w:tcPr>
+          <w:p>
+            <w:pPr>
+              <w:spacing w:after="40" w:line="252"/>
+            </w:pPr>
+            <w:r>
+              <w:rPr>
+                <w:sz w:val="18"/>
+                <w:szCs w:val="18"/>
+              </w:rPr>
+              <w:t xml:space="preserve">Controller with mocks</w:t>
+            </w:r>
+          </w:p>
+        </w:tc>
+        <w:tc>
+          <w:tcPr>
+            <w:tcW w:type="dxa" w:w="600"/>
+            <w:tcBorders>
+              <w:top w:val="single" w:color="D9D2C3" w:sz="4"/>
+              <w:left w:val="single" w:color="D9D2C3" w:sz="4"/>
+              <w:bottom w:val="single" w:color="D9D2C3" w:sz="4"/>
+              <w:right w:val="single" w:color="D9D2C3" w:sz="4"/>
+            </w:tcBorders>
+            <w:tcMar>
+              <w:top w:type="dxa" w:w="70"/>
+              <w:left w:type="dxa" w:w="100"/>
+              <w:bottom w:type="dxa" w:w="50"/>
+              <w:right w:type="dxa" w:w="100"/>
+            </w:tcMar>
+          </w:tcPr>
+          <w:p>
+            <w:pPr>
+              <w:spacing w:after="40" w:line="252"/>
+            </w:pPr>
+            <w:r>
+              <w:rPr>
+                <w:sz w:val="18"/>
+                <w:szCs w:val="18"/>
+              </w:rPr>
+              <w:t xml:space="preserve">13</w:t>
+            </w:r>
+          </w:p>
+        </w:tc>
+        <w:tc>
+          <w:tcPr>
+            <w:tcW w:type="dxa" w:w="3288"/>
+            <w:tcBorders>
+              <w:top w:val="single" w:color="D9D2C3" w:sz="4"/>
+              <w:left w:val="single" w:color="D9D2C3" w:sz="4"/>
+              <w:bottom w:val="single" w:color="D9D2C3" w:sz="4"/>
+              <w:right w:val="single" w:color="D9D2C3" w:sz="4"/>
+            </w:tcBorders>
+            <w:tcMar>
+              <w:top w:type="dxa" w:w="70"/>
+              <w:left w:type="dxa" w:w="100"/>
+              <w:bottom w:type="dxa" w:w="50"/>
+              <w:right w:type="dxa" w:w="100"/>
+            </w:tcMar>
+          </w:tcPr>
+          <w:p>
+            <w:pPr>
+              <w:spacing w:after="40" w:line="252"/>
+            </w:pPr>
+            <w:r>
+              <w:rPr>
+                <w:sz w:val="18"/>
+                <w:szCs w:val="18"/>
+              </w:rPr>
+              <w:t xml:space="preserve">Officer routes, role access, form tokens, database-error messages, bad slot id, unknown service gives 404</w:t>
             </w:r>
           </w:p>
         </w:tc>
@@ -12438,7 +13799,7 @@
         </w:tc>
         <w:tc>
           <w:tcPr>
-            <w:tcW w:type="dxa" w:w="800"/>
+            <w:tcW w:type="dxa" w:w="1250"/>
             <w:tcBorders>
               <w:top w:val="single" w:color="D9D2C3" w:sz="4"/>
               <w:left w:val="single" w:color="D9D2C3" w:sz="4"/>
@@ -12462,13 +13823,43 @@
                 <w:sz w:val="18"/>
                 <w:szCs w:val="18"/>
               </w:rPr>
+              <w:t xml:space="preserve">Integration</w:t>
+            </w:r>
+          </w:p>
+        </w:tc>
+        <w:tc>
+          <w:tcPr>
+            <w:tcW w:type="dxa" w:w="600"/>
+            <w:tcBorders>
+              <w:top w:val="single" w:color="D9D2C3" w:sz="4"/>
+              <w:left w:val="single" w:color="D9D2C3" w:sz="4"/>
+              <w:bottom w:val="single" w:color="D9D2C3" w:sz="4"/>
+              <w:right w:val="single" w:color="D9D2C3" w:sz="4"/>
+            </w:tcBorders>
+            <w:shd w:fill="FBF8F1" w:color="auto" w:val="clear"/>
+            <w:tcMar>
+              <w:top w:type="dxa" w:w="70"/>
+              <w:left w:type="dxa" w:w="100"/>
+              <w:bottom w:type="dxa" w:w="50"/>
+              <w:right w:type="dxa" w:w="100"/>
+            </w:tcMar>
+          </w:tcPr>
+          <w:p>
+            <w:pPr>
+              <w:spacing w:after="40" w:line="252"/>
+            </w:pPr>
+            <w:r>
+              <w:rPr>
+                <w:sz w:val="18"/>
+                <w:szCs w:val="18"/>
+              </w:rPr>
               <w:t xml:space="preserve">14</w:t>
             </w:r>
           </w:p>
         </w:tc>
         <w:tc>
           <w:tcPr>
-            <w:tcW w:type="dxa" w:w="4338"/>
+            <w:tcW w:type="dxa" w:w="3288"/>
             <w:tcBorders>
               <w:top w:val="single" w:color="D9D2C3" w:sz="4"/>
               <w:left w:val="single" w:color="D9D2C3" w:sz="4"/>
@@ -12492,7 +13883,7 @@
                 <w:sz w:val="18"/>
                 <w:szCs w:val="18"/>
               </w:rPr>
-              <w:t xml:space="preserve">Check-in, collection, expired pass, missed booking (officer picks the slot; full, past, other-centre and other-service slots are refused), closing and deleting slots (needs the database)</w:t>
+              <w:t xml:space="preserve">Check-in, collection, expired pass, missed booking (officer picks the slot; full, past, other-centre and other-service slots are refused), closing and deleting slots</w:t>
             </w:r>
           </w:p>
         </w:tc>
@@ -12534,7 +13925,36 @@
         </w:tc>
         <w:tc>
           <w:tcPr>
-            <w:tcW w:type="dxa" w:w="800"/>
+            <w:tcW w:type="dxa" w:w="1250"/>
+            <w:tcBorders>
+              <w:top w:val="single" w:color="D9D2C3" w:sz="4"/>
+              <w:left w:val="single" w:color="D9D2C3" w:sz="4"/>
+              <w:bottom w:val="single" w:color="D9D2C3" w:sz="4"/>
+              <w:right w:val="single" w:color="D9D2C3" w:sz="4"/>
+            </w:tcBorders>
+            <w:tcMar>
+              <w:top w:type="dxa" w:w="70"/>
+              <w:left w:type="dxa" w:w="100"/>
+              <w:bottom w:type="dxa" w:w="50"/>
+              <w:right w:type="dxa" w:w="100"/>
+            </w:tcMar>
+          </w:tcPr>
+          <w:p>
+            <w:pPr>
+              <w:spacing w:after="40" w:line="252"/>
+            </w:pPr>
+            <w:r>
+              <w:rPr>
+                <w:sz w:val="18"/>
+                <w:szCs w:val="18"/>
+              </w:rPr>
+              <w:t xml:space="preserve">Integration</w:t>
+            </w:r>
+          </w:p>
+        </w:tc>
+        <w:tc>
+          <w:tcPr>
+            <w:tcW w:type="dxa" w:w="600"/>
             <w:tcBorders>
               <w:top w:val="single" w:color="D9D2C3" w:sz="4"/>
               <w:left w:val="single" w:color="D9D2C3" w:sz="4"/>
@@ -12563,30 +13983,30 @@
         </w:tc>
         <w:tc>
           <w:tcPr>
-            <w:tcW w:type="dxa" w:w="4338"/>
-            <w:tcBorders>
-              <w:top w:val="single" w:color="D9D2C3" w:sz="4"/>
-              <w:left w:val="single" w:color="D9D2C3" w:sz="4"/>
-              <w:bottom w:val="single" w:color="D9D2C3" w:sz="4"/>
-              <w:right w:val="single" w:color="D9D2C3" w:sz="4"/>
-            </w:tcBorders>
-            <w:tcMar>
-              <w:top w:type="dxa" w:w="70"/>
-              <w:left w:type="dxa" w:w="100"/>
-              <w:bottom w:type="dxa" w:w="50"/>
-              <w:right w:type="dxa" w:w="100"/>
-            </w:tcMar>
-          </w:tcPr>
-          <w:p>
-            <w:pPr>
-              <w:spacing w:after="40" w:line="252"/>
-            </w:pPr>
-            <w:r>
-              <w:rPr>
-                <w:sz w:val="18"/>
-                <w:szCs w:val="18"/>
-              </w:rPr>
-              <w:t xml:space="preserve">Biometric cancel, reschedule, rebook, stale forms (plus walk-in cases; needs the database)</w:t>
+            <w:tcW w:type="dxa" w:w="3288"/>
+            <w:tcBorders>
+              <w:top w:val="single" w:color="D9D2C3" w:sz="4"/>
+              <w:left w:val="single" w:color="D9D2C3" w:sz="4"/>
+              <w:bottom w:val="single" w:color="D9D2C3" w:sz="4"/>
+              <w:right w:val="single" w:color="D9D2C3" w:sz="4"/>
+            </w:tcBorders>
+            <w:tcMar>
+              <w:top w:type="dxa" w:w="70"/>
+              <w:left w:type="dxa" w:w="100"/>
+              <w:bottom w:type="dxa" w:w="50"/>
+              <w:right w:type="dxa" w:w="100"/>
+            </w:tcMar>
+          </w:tcPr>
+          <w:p>
+            <w:pPr>
+              <w:spacing w:after="40" w:line="252"/>
+            </w:pPr>
+            <w:r>
+              <w:rPr>
+                <w:sz w:val="18"/>
+                <w:szCs w:val="18"/>
+              </w:rPr>
+              <w:t xml:space="preserve">Biometric cancel, reschedule, rebook, stale forms (plus walk-in cases)</w:t>
             </w:r>
           </w:p>
         </w:tc>
@@ -12629,7 +14049,7 @@
         </w:tc>
         <w:tc>
           <w:tcPr>
-            <w:tcW w:type="dxa" w:w="800"/>
+            <w:tcW w:type="dxa" w:w="1250"/>
             <w:tcBorders>
               <w:top w:val="single" w:color="D9D2C3" w:sz="4"/>
               <w:left w:val="single" w:color="D9D2C3" w:sz="4"/>
@@ -12653,13 +14073,43 @@
                 <w:sz w:val="18"/>
                 <w:szCs w:val="18"/>
               </w:rPr>
+              <w:t xml:space="preserve">Integration</w:t>
+            </w:r>
+          </w:p>
+        </w:tc>
+        <w:tc>
+          <w:tcPr>
+            <w:tcW w:type="dxa" w:w="600"/>
+            <w:tcBorders>
+              <w:top w:val="single" w:color="D9D2C3" w:sz="4"/>
+              <w:left w:val="single" w:color="D9D2C3" w:sz="4"/>
+              <w:bottom w:val="single" w:color="D9D2C3" w:sz="4"/>
+              <w:right w:val="single" w:color="D9D2C3" w:sz="4"/>
+            </w:tcBorders>
+            <w:shd w:fill="FBF8F1" w:color="auto" w:val="clear"/>
+            <w:tcMar>
+              <w:top w:type="dxa" w:w="70"/>
+              <w:left w:type="dxa" w:w="100"/>
+              <w:bottom w:type="dxa" w:w="50"/>
+              <w:right w:type="dxa" w:w="100"/>
+            </w:tcMar>
+          </w:tcPr>
+          <w:p>
+            <w:pPr>
+              <w:spacing w:after="40" w:line="252"/>
+            </w:pPr>
+            <w:r>
+              <w:rPr>
+                <w:sz w:val="18"/>
+                <w:szCs w:val="18"/>
+              </w:rPr>
               <w:t xml:space="preserve">3</w:t>
             </w:r>
           </w:p>
         </w:tc>
         <w:tc>
           <w:tcPr>
-            <w:tcW w:type="dxa" w:w="4338"/>
+            <w:tcW w:type="dxa" w:w="3288"/>
             <w:tcBorders>
               <w:top w:val="single" w:color="D9D2C3" w:sz="4"/>
               <w:left w:val="single" w:color="D9D2C3" w:sz="4"/>
@@ -12683,12 +14133,1786 @@
                 <w:sz w:val="18"/>
                 <w:szCs w:val="18"/>
               </w:rPr>
-              <w:t xml:space="preserve">Payment, booking, QR, check-in and collection for NIC and passport (needs the database)</w:t>
+              <w:t xml:space="preserve">Payment, booking, QR, check-in and collection for NIC and passport</w:t>
             </w:r>
           </w:p>
         </w:tc>
       </w:tr>
     </w:tbl>
+    <w:p>
+      <w:pPr>
+        <w:spacing w:after="120"/>
+      </w:pPr>
+    </w:p>
+    <w:p>
+      <w:pPr>
+        <w:pStyle w:val="Heading2"/>
+        <w:keepNext/>
+      </w:pPr>
+      <w:r>
+        <w:t xml:space="preserve">12.3 Example test cases (black box)</w:t>
+      </w:r>
+    </w:p>
+    <w:tbl>
+      <w:tblPr>
+        <w:tblW w:type="dxa" w:w="9638"/>
+        <w:tblBorders>
+          <w:top w:val="single" w:color="auto" w:sz="4"/>
+          <w:left w:val="single" w:color="auto" w:sz="4"/>
+          <w:bottom w:val="single" w:color="auto" w:sz="4"/>
+          <w:right w:val="single" w:color="auto" w:sz="4"/>
+          <w:insideH w:val="single" w:color="auto" w:sz="4"/>
+          <w:insideV w:val="single" w:color="auto" w:sz="4"/>
+        </w:tblBorders>
+        <w:tblLayout w:type="fixed"/>
+      </w:tblPr>
+      <w:tblGrid>
+        <w:gridCol w:w="4300"/>
+        <w:gridCol w:w="3638"/>
+        <w:gridCol w:w="1700"/>
+      </w:tblGrid>
+      <w:tr>
+        <w:trPr>
+          <w:cantSplit/>
+          <w:tblHeader/>
+        </w:trPr>
+        <w:tc>
+          <w:tcPr>
+            <w:tcW w:type="dxa" w:w="4300"/>
+            <w:tcBorders>
+              <w:top w:val="single" w:color="D9D2C3" w:sz="4"/>
+              <w:left w:val="single" w:color="D9D2C3" w:sz="4"/>
+              <w:bottom w:val="single" w:color="D9D2C3" w:sz="4"/>
+              <w:right w:val="single" w:color="D9D2C3" w:sz="4"/>
+            </w:tcBorders>
+            <w:shd w:fill="681042" w:color="auto" w:val="clear"/>
+            <w:tcMar>
+              <w:top w:type="dxa" w:w="70"/>
+              <w:left w:type="dxa" w:w="100"/>
+              <w:bottom w:type="dxa" w:w="50"/>
+              <w:right w:type="dxa" w:w="100"/>
+            </w:tcMar>
+          </w:tcPr>
+          <w:p>
+            <w:pPr>
+              <w:spacing w:after="40" w:line="252"/>
+            </w:pPr>
+            <w:r>
+              <w:rPr>
+                <w:b/>
+                <w:bCs/>
+                <w:color w:val="FFFFFF"/>
+                <w:sz w:val="18"/>
+                <w:szCs w:val="18"/>
+              </w:rPr>
+              <w:t xml:space="preserve">Scenario (input)</w:t>
+            </w:r>
+          </w:p>
+        </w:tc>
+        <w:tc>
+          <w:tcPr>
+            <w:tcW w:type="dxa" w:w="3638"/>
+            <w:tcBorders>
+              <w:top w:val="single" w:color="D9D2C3" w:sz="4"/>
+              <w:left w:val="single" w:color="D9D2C3" w:sz="4"/>
+              <w:bottom w:val="single" w:color="D9D2C3" w:sz="4"/>
+              <w:right w:val="single" w:color="D9D2C3" w:sz="4"/>
+            </w:tcBorders>
+            <w:shd w:fill="681042" w:color="auto" w:val="clear"/>
+            <w:tcMar>
+              <w:top w:type="dxa" w:w="70"/>
+              <w:left w:type="dxa" w:w="100"/>
+              <w:bottom w:type="dxa" w:w="50"/>
+              <w:right w:type="dxa" w:w="100"/>
+            </w:tcMar>
+          </w:tcPr>
+          <w:p>
+            <w:pPr>
+              <w:spacing w:after="40" w:line="252"/>
+            </w:pPr>
+            <w:r>
+              <w:rPr>
+                <w:b/>
+                <w:bCs/>
+                <w:color w:val="FFFFFF"/>
+                <w:sz w:val="18"/>
+                <w:szCs w:val="18"/>
+              </w:rPr>
+              <w:t xml:space="preserve">Expected result</w:t>
+            </w:r>
+          </w:p>
+        </w:tc>
+        <w:tc>
+          <w:tcPr>
+            <w:tcW w:type="dxa" w:w="1700"/>
+            <w:tcBorders>
+              <w:top w:val="single" w:color="D9D2C3" w:sz="4"/>
+              <w:left w:val="single" w:color="D9D2C3" w:sz="4"/>
+              <w:bottom w:val="single" w:color="D9D2C3" w:sz="4"/>
+              <w:right w:val="single" w:color="D9D2C3" w:sz="4"/>
+            </w:tcBorders>
+            <w:shd w:fill="681042" w:color="auto" w:val="clear"/>
+            <w:tcMar>
+              <w:top w:type="dxa" w:w="70"/>
+              <w:left w:type="dxa" w:w="100"/>
+              <w:bottom w:type="dxa" w:w="50"/>
+              <w:right w:type="dxa" w:w="100"/>
+            </w:tcMar>
+          </w:tcPr>
+          <w:p>
+            <w:pPr>
+              <w:spacing w:after="40" w:line="252"/>
+            </w:pPr>
+            <w:r>
+              <w:rPr>
+                <w:b/>
+                <w:bCs/>
+                <w:color w:val="FFFFFF"/>
+                <w:sz w:val="18"/>
+                <w:szCs w:val="18"/>
+              </w:rPr>
+              <w:t xml:space="preserve">Technique</w:t>
+            </w:r>
+          </w:p>
+        </w:tc>
+      </w:tr>
+      <w:tr>
+        <w:trPr>
+          <w:cantSplit/>
+        </w:trPr>
+        <w:tc>
+          <w:tcPr>
+            <w:tcW w:type="dxa" w:w="4300"/>
+            <w:tcBorders>
+              <w:top w:val="single" w:color="D9D2C3" w:sz="4"/>
+              <w:left w:val="single" w:color="D9D2C3" w:sz="4"/>
+              <w:bottom w:val="single" w:color="D9D2C3" w:sz="4"/>
+              <w:right w:val="single" w:color="D9D2C3" w:sz="4"/>
+            </w:tcBorders>
+            <w:tcMar>
+              <w:top w:type="dxa" w:w="70"/>
+              <w:left w:type="dxa" w:w="100"/>
+              <w:bottom w:type="dxa" w:w="50"/>
+              <w:right w:type="dxa" w:w="100"/>
+            </w:tcMar>
+          </w:tcPr>
+          <w:p>
+            <w:pPr>
+              <w:spacing w:after="40" w:line="252"/>
+            </w:pPr>
+            <w:r>
+              <w:rPr>
+                <w:sz w:val="18"/>
+                <w:szCs w:val="18"/>
+              </w:rPr>
+              <w:t xml:space="preserve">Cancel a booking exactly 72 hours before it</w:t>
+            </w:r>
+          </w:p>
+        </w:tc>
+        <w:tc>
+          <w:tcPr>
+            <w:tcW w:type="dxa" w:w="3638"/>
+            <w:tcBorders>
+              <w:top w:val="single" w:color="D9D2C3" w:sz="4"/>
+              <w:left w:val="single" w:color="D9D2C3" w:sz="4"/>
+              <w:bottom w:val="single" w:color="D9D2C3" w:sz="4"/>
+              <w:right w:val="single" w:color="D9D2C3" w:sz="4"/>
+            </w:tcBorders>
+            <w:tcMar>
+              <w:top w:type="dxa" w:w="70"/>
+              <w:left w:type="dxa" w:w="100"/>
+              <w:bottom w:type="dxa" w:w="50"/>
+              <w:right w:type="dxa" w:w="100"/>
+            </w:tcMar>
+          </w:tcPr>
+          <w:p>
+            <w:pPr>
+              <w:spacing w:after="40" w:line="252"/>
+            </w:pPr>
+            <w:r>
+              <w:rPr>
+                <w:sz w:val="18"/>
+                <w:szCs w:val="18"/>
+              </w:rPr>
+              <w:t xml:space="preserve">Allowed</w:t>
+            </w:r>
+          </w:p>
+        </w:tc>
+        <w:tc>
+          <w:tcPr>
+            <w:tcW w:type="dxa" w:w="1700"/>
+            <w:tcBorders>
+              <w:top w:val="single" w:color="D9D2C3" w:sz="4"/>
+              <w:left w:val="single" w:color="D9D2C3" w:sz="4"/>
+              <w:bottom w:val="single" w:color="D9D2C3" w:sz="4"/>
+              <w:right w:val="single" w:color="D9D2C3" w:sz="4"/>
+            </w:tcBorders>
+            <w:tcMar>
+              <w:top w:type="dxa" w:w="70"/>
+              <w:left w:type="dxa" w:w="100"/>
+              <w:bottom w:type="dxa" w:w="50"/>
+              <w:right w:type="dxa" w:w="100"/>
+            </w:tcMar>
+          </w:tcPr>
+          <w:p>
+            <w:pPr>
+              <w:spacing w:after="40" w:line="252"/>
+            </w:pPr>
+            <w:r>
+              <w:rPr>
+                <w:sz w:val="18"/>
+                <w:szCs w:val="18"/>
+              </w:rPr>
+              <w:t xml:space="preserve">Boundary value</w:t>
+            </w:r>
+          </w:p>
+        </w:tc>
+      </w:tr>
+      <w:tr>
+        <w:trPr>
+          <w:cantSplit/>
+        </w:trPr>
+        <w:tc>
+          <w:tcPr>
+            <w:tcW w:type="dxa" w:w="4300"/>
+            <w:tcBorders>
+              <w:top w:val="single" w:color="D9D2C3" w:sz="4"/>
+              <w:left w:val="single" w:color="D9D2C3" w:sz="4"/>
+              <w:bottom w:val="single" w:color="D9D2C3" w:sz="4"/>
+              <w:right w:val="single" w:color="D9D2C3" w:sz="4"/>
+            </w:tcBorders>
+            <w:shd w:fill="FBF8F1" w:color="auto" w:val="clear"/>
+            <w:tcMar>
+              <w:top w:type="dxa" w:w="70"/>
+              <w:left w:type="dxa" w:w="100"/>
+              <w:bottom w:type="dxa" w:w="50"/>
+              <w:right w:type="dxa" w:w="100"/>
+            </w:tcMar>
+          </w:tcPr>
+          <w:p>
+            <w:pPr>
+              <w:spacing w:after="40" w:line="252"/>
+            </w:pPr>
+            <w:r>
+              <w:rPr>
+                <w:sz w:val="18"/>
+                <w:szCs w:val="18"/>
+              </w:rPr>
+              <w:t xml:space="preserve">Cancel less than 72 hours before, or open another citizen's booking</w:t>
+            </w:r>
+          </w:p>
+        </w:tc>
+        <w:tc>
+          <w:tcPr>
+            <w:tcW w:type="dxa" w:w="3638"/>
+            <w:tcBorders>
+              <w:top w:val="single" w:color="D9D2C3" w:sz="4"/>
+              <w:left w:val="single" w:color="D9D2C3" w:sz="4"/>
+              <w:bottom w:val="single" w:color="D9D2C3" w:sz="4"/>
+              <w:right w:val="single" w:color="D9D2C3" w:sz="4"/>
+            </w:tcBorders>
+            <w:shd w:fill="FBF8F1" w:color="auto" w:val="clear"/>
+            <w:tcMar>
+              <w:top w:type="dxa" w:w="70"/>
+              <w:left w:type="dxa" w:w="100"/>
+              <w:bottom w:type="dxa" w:w="50"/>
+              <w:right w:type="dxa" w:w="100"/>
+            </w:tcMar>
+          </w:tcPr>
+          <w:p>
+            <w:pPr>
+              <w:spacing w:after="40" w:line="252"/>
+            </w:pPr>
+            <w:r>
+              <w:rPr>
+                <w:sz w:val="18"/>
+                <w:szCs w:val="18"/>
+              </w:rPr>
+              <w:t xml:space="preserve">Refused with a clear message</w:t>
+            </w:r>
+          </w:p>
+        </w:tc>
+        <w:tc>
+          <w:tcPr>
+            <w:tcW w:type="dxa" w:w="1700"/>
+            <w:tcBorders>
+              <w:top w:val="single" w:color="D9D2C3" w:sz="4"/>
+              <w:left w:val="single" w:color="D9D2C3" w:sz="4"/>
+              <w:bottom w:val="single" w:color="D9D2C3" w:sz="4"/>
+              <w:right w:val="single" w:color="D9D2C3" w:sz="4"/>
+            </w:tcBorders>
+            <w:shd w:fill="FBF8F1" w:color="auto" w:val="clear"/>
+            <w:tcMar>
+              <w:top w:type="dxa" w:w="70"/>
+              <w:left w:type="dxa" w:w="100"/>
+              <w:bottom w:type="dxa" w:w="50"/>
+              <w:right w:type="dxa" w:w="100"/>
+            </w:tcMar>
+          </w:tcPr>
+          <w:p>
+            <w:pPr>
+              <w:spacing w:after="40" w:line="252"/>
+            </w:pPr>
+            <w:r>
+              <w:rPr>
+                <w:sz w:val="18"/>
+                <w:szCs w:val="18"/>
+              </w:rPr>
+              <w:t xml:space="preserve">Negative</w:t>
+            </w:r>
+          </w:p>
+        </w:tc>
+      </w:tr>
+      <w:tr>
+        <w:trPr>
+          <w:cantSplit/>
+        </w:trPr>
+        <w:tc>
+          <w:tcPr>
+            <w:tcW w:type="dxa" w:w="4300"/>
+            <w:tcBorders>
+              <w:top w:val="single" w:color="D9D2C3" w:sz="4"/>
+              <w:left w:val="single" w:color="D9D2C3" w:sz="4"/>
+              <w:bottom w:val="single" w:color="D9D2C3" w:sz="4"/>
+              <w:right w:val="single" w:color="D9D2C3" w:sz="4"/>
+            </w:tcBorders>
+            <w:tcMar>
+              <w:top w:type="dxa" w:w="70"/>
+              <w:left w:type="dxa" w:w="100"/>
+              <w:bottom w:type="dxa" w:w="50"/>
+              <w:right w:type="dxa" w:w="100"/>
+            </w:tcMar>
+          </w:tcPr>
+          <w:p>
+            <w:pPr>
+              <w:spacing w:after="40" w:line="252"/>
+            </w:pPr>
+            <w:r>
+              <w:rPr>
+                <w:sz w:val="18"/>
+                <w:szCs w:val="18"/>
+              </w:rPr>
+              <w:t xml:space="preserve">Booked date has passed (missed booking)</w:t>
+            </w:r>
+          </w:p>
+        </w:tc>
+        <w:tc>
+          <w:tcPr>
+            <w:tcW w:type="dxa" w:w="3638"/>
+            <w:tcBorders>
+              <w:top w:val="single" w:color="D9D2C3" w:sz="4"/>
+              <w:left w:val="single" w:color="D9D2C3" w:sz="4"/>
+              <w:bottom w:val="single" w:color="D9D2C3" w:sz="4"/>
+              <w:right w:val="single" w:color="D9D2C3" w:sz="4"/>
+            </w:tcBorders>
+            <w:tcMar>
+              <w:top w:type="dxa" w:w="70"/>
+              <w:left w:type="dxa" w:w="100"/>
+              <w:bottom w:type="dxa" w:w="50"/>
+              <w:right w:type="dxa" w:w="100"/>
+            </w:tcMar>
+          </w:tcPr>
+          <w:p>
+            <w:pPr>
+              <w:spacing w:after="40" w:line="252"/>
+            </w:pPr>
+            <w:r>
+              <w:rPr>
+                <w:sz w:val="18"/>
+                <w:szCs w:val="18"/>
+              </w:rPr>
+              <w:t xml:space="preserve">Cannot cancel, but can reschedule</w:t>
+            </w:r>
+          </w:p>
+        </w:tc>
+        <w:tc>
+          <w:tcPr>
+            <w:tcW w:type="dxa" w:w="1700"/>
+            <w:tcBorders>
+              <w:top w:val="single" w:color="D9D2C3" w:sz="4"/>
+              <w:left w:val="single" w:color="D9D2C3" w:sz="4"/>
+              <w:bottom w:val="single" w:color="D9D2C3" w:sz="4"/>
+              <w:right w:val="single" w:color="D9D2C3" w:sz="4"/>
+            </w:tcBorders>
+            <w:tcMar>
+              <w:top w:type="dxa" w:w="70"/>
+              <w:left w:type="dxa" w:w="100"/>
+              <w:bottom w:type="dxa" w:w="50"/>
+              <w:right w:type="dxa" w:w="100"/>
+            </w:tcMar>
+          </w:tcPr>
+          <w:p>
+            <w:pPr>
+              <w:spacing w:after="40" w:line="252"/>
+            </w:pPr>
+            <w:r>
+              <w:rPr>
+                <w:sz w:val="18"/>
+                <w:szCs w:val="18"/>
+              </w:rPr>
+              <w:t xml:space="preserve">Equivalence class</w:t>
+            </w:r>
+          </w:p>
+        </w:tc>
+      </w:tr>
+      <w:tr>
+        <w:trPr>
+          <w:cantSplit/>
+        </w:trPr>
+        <w:tc>
+          <w:tcPr>
+            <w:tcW w:type="dxa" w:w="4300"/>
+            <w:tcBorders>
+              <w:top w:val="single" w:color="D9D2C3" w:sz="4"/>
+              <w:left w:val="single" w:color="D9D2C3" w:sz="4"/>
+              <w:bottom w:val="single" w:color="D9D2C3" w:sz="4"/>
+              <w:right w:val="single" w:color="D9D2C3" w:sz="4"/>
+            </w:tcBorders>
+            <w:shd w:fill="FBF8F1" w:color="auto" w:val="clear"/>
+            <w:tcMar>
+              <w:top w:type="dxa" w:w="70"/>
+              <w:left w:type="dxa" w:w="100"/>
+              <w:bottom w:type="dxa" w:w="50"/>
+              <w:right w:type="dxa" w:w="100"/>
+            </w:tcMar>
+          </w:tcPr>
+          <w:p>
+            <w:pPr>
+              <w:spacing w:after="40" w:line="252"/>
+            </w:pPr>
+            <w:r>
+              <w:rPr>
+                <w:sz w:val="18"/>
+                <w:szCs w:val="18"/>
+              </w:rPr>
+              <w:t xml:space="preserve">Check in on a date other than the booked date</w:t>
+            </w:r>
+          </w:p>
+        </w:tc>
+        <w:tc>
+          <w:tcPr>
+            <w:tcW w:type="dxa" w:w="3638"/>
+            <w:tcBorders>
+              <w:top w:val="single" w:color="D9D2C3" w:sz="4"/>
+              <w:left w:val="single" w:color="D9D2C3" w:sz="4"/>
+              <w:bottom w:val="single" w:color="D9D2C3" w:sz="4"/>
+              <w:right w:val="single" w:color="D9D2C3" w:sz="4"/>
+            </w:tcBorders>
+            <w:shd w:fill="FBF8F1" w:color="auto" w:val="clear"/>
+            <w:tcMar>
+              <w:top w:type="dxa" w:w="70"/>
+              <w:left w:type="dxa" w:w="100"/>
+              <w:bottom w:type="dxa" w:w="50"/>
+              <w:right w:type="dxa" w:w="100"/>
+            </w:tcMar>
+          </w:tcPr>
+          <w:p>
+            <w:pPr>
+              <w:spacing w:after="40" w:line="252"/>
+            </w:pPr>
+            <w:r>
+              <w:rPr>
+                <w:sz w:val="18"/>
+                <w:szCs w:val="18"/>
+              </w:rPr>
+              <w:t xml:space="preserve">Refused</w:t>
+            </w:r>
+          </w:p>
+        </w:tc>
+        <w:tc>
+          <w:tcPr>
+            <w:tcW w:type="dxa" w:w="1700"/>
+            <w:tcBorders>
+              <w:top w:val="single" w:color="D9D2C3" w:sz="4"/>
+              <w:left w:val="single" w:color="D9D2C3" w:sz="4"/>
+              <w:bottom w:val="single" w:color="D9D2C3" w:sz="4"/>
+              <w:right w:val="single" w:color="D9D2C3" w:sz="4"/>
+            </w:tcBorders>
+            <w:shd w:fill="FBF8F1" w:color="auto" w:val="clear"/>
+            <w:tcMar>
+              <w:top w:type="dxa" w:w="70"/>
+              <w:left w:type="dxa" w:w="100"/>
+              <w:bottom w:type="dxa" w:w="50"/>
+              <w:right w:type="dxa" w:w="100"/>
+            </w:tcMar>
+          </w:tcPr>
+          <w:p>
+            <w:pPr>
+              <w:spacing w:after="40" w:line="252"/>
+            </w:pPr>
+            <w:r>
+              <w:rPr>
+                <w:sz w:val="18"/>
+                <w:szCs w:val="18"/>
+              </w:rPr>
+              <w:t xml:space="preserve">Negative</w:t>
+            </w:r>
+          </w:p>
+        </w:tc>
+      </w:tr>
+      <w:tr>
+        <w:trPr>
+          <w:cantSplit/>
+        </w:trPr>
+        <w:tc>
+          <w:tcPr>
+            <w:tcW w:type="dxa" w:w="4300"/>
+            <w:tcBorders>
+              <w:top w:val="single" w:color="D9D2C3" w:sz="4"/>
+              <w:left w:val="single" w:color="D9D2C3" w:sz="4"/>
+              <w:bottom w:val="single" w:color="D9D2C3" w:sz="4"/>
+              <w:right w:val="single" w:color="D9D2C3" w:sz="4"/>
+            </w:tcBorders>
+            <w:tcMar>
+              <w:top w:type="dxa" w:w="70"/>
+              <w:left w:type="dxa" w:w="100"/>
+              <w:bottom w:type="dxa" w:w="50"/>
+              <w:right w:type="dxa" w:w="100"/>
+            </w:tcMar>
+          </w:tcPr>
+          <w:p>
+            <w:pPr>
+              <w:spacing w:after="40" w:line="252"/>
+            </w:pPr>
+            <w:r>
+              <w:rPr>
+                <w:sz w:val="18"/>
+                <w:szCs w:val="18"/>
+              </w:rPr>
+              <w:t xml:space="preserve">Check the same citizen in twice</w:t>
+            </w:r>
+          </w:p>
+        </w:tc>
+        <w:tc>
+          <w:tcPr>
+            <w:tcW w:type="dxa" w:w="3638"/>
+            <w:tcBorders>
+              <w:top w:val="single" w:color="D9D2C3" w:sz="4"/>
+              <w:left w:val="single" w:color="D9D2C3" w:sz="4"/>
+              <w:bottom w:val="single" w:color="D9D2C3" w:sz="4"/>
+              <w:right w:val="single" w:color="D9D2C3" w:sz="4"/>
+            </w:tcBorders>
+            <w:tcMar>
+              <w:top w:type="dxa" w:w="70"/>
+              <w:left w:type="dxa" w:w="100"/>
+              <w:bottom w:type="dxa" w:w="50"/>
+              <w:right w:type="dxa" w:w="100"/>
+            </w:tcMar>
+          </w:tcPr>
+          <w:p>
+            <w:pPr>
+              <w:spacing w:after="40" w:line="252"/>
+            </w:pPr>
+            <w:r>
+              <w:rPr>
+                <w:sz w:val="18"/>
+                <w:szCs w:val="18"/>
+              </w:rPr>
+              <w:t xml:space="preserve">Second check-in refused</w:t>
+            </w:r>
+          </w:p>
+        </w:tc>
+        <w:tc>
+          <w:tcPr>
+            <w:tcW w:type="dxa" w:w="1700"/>
+            <w:tcBorders>
+              <w:top w:val="single" w:color="D9D2C3" w:sz="4"/>
+              <w:left w:val="single" w:color="D9D2C3" w:sz="4"/>
+              <w:bottom w:val="single" w:color="D9D2C3" w:sz="4"/>
+              <w:right w:val="single" w:color="D9D2C3" w:sz="4"/>
+            </w:tcBorders>
+            <w:tcMar>
+              <w:top w:type="dxa" w:w="70"/>
+              <w:left w:type="dxa" w:w="100"/>
+              <w:bottom w:type="dxa" w:w="50"/>
+              <w:right w:type="dxa" w:w="100"/>
+            </w:tcMar>
+          </w:tcPr>
+          <w:p>
+            <w:pPr>
+              <w:spacing w:after="40" w:line="252"/>
+            </w:pPr>
+            <w:r>
+              <w:rPr>
+                <w:sz w:val="18"/>
+                <w:szCs w:val="18"/>
+              </w:rPr>
+              <w:t xml:space="preserve">Negative</w:t>
+            </w:r>
+          </w:p>
+        </w:tc>
+      </w:tr>
+      <w:tr>
+        <w:trPr>
+          <w:cantSplit/>
+        </w:trPr>
+        <w:tc>
+          <w:tcPr>
+            <w:tcW w:type="dxa" w:w="4300"/>
+            <w:tcBorders>
+              <w:top w:val="single" w:color="D9D2C3" w:sz="4"/>
+              <w:left w:val="single" w:color="D9D2C3" w:sz="4"/>
+              <w:bottom w:val="single" w:color="D9D2C3" w:sz="4"/>
+              <w:right w:val="single" w:color="D9D2C3" w:sz="4"/>
+            </w:tcBorders>
+            <w:shd w:fill="FBF8F1" w:color="auto" w:val="clear"/>
+            <w:tcMar>
+              <w:top w:type="dxa" w:w="70"/>
+              <w:left w:type="dxa" w:w="100"/>
+              <w:bottom w:type="dxa" w:w="50"/>
+              <w:right w:type="dxa" w:w="100"/>
+            </w:tcMar>
+          </w:tcPr>
+          <w:p>
+            <w:pPr>
+              <w:spacing w:after="40" w:line="252"/>
+            </w:pPr>
+            <w:r>
+              <w:rPr>
+                <w:sz w:val="18"/>
+                <w:szCs w:val="18"/>
+              </w:rPr>
+              <w:t xml:space="preserve">Collect biometrics before check-in, or a second time</w:t>
+            </w:r>
+          </w:p>
+        </w:tc>
+        <w:tc>
+          <w:tcPr>
+            <w:tcW w:type="dxa" w:w="3638"/>
+            <w:tcBorders>
+              <w:top w:val="single" w:color="D9D2C3" w:sz="4"/>
+              <w:left w:val="single" w:color="D9D2C3" w:sz="4"/>
+              <w:bottom w:val="single" w:color="D9D2C3" w:sz="4"/>
+              <w:right w:val="single" w:color="D9D2C3" w:sz="4"/>
+            </w:tcBorders>
+            <w:shd w:fill="FBF8F1" w:color="auto" w:val="clear"/>
+            <w:tcMar>
+              <w:top w:type="dxa" w:w="70"/>
+              <w:left w:type="dxa" w:w="100"/>
+              <w:bottom w:type="dxa" w:w="50"/>
+              <w:right w:type="dxa" w:w="100"/>
+            </w:tcMar>
+          </w:tcPr>
+          <w:p>
+            <w:pPr>
+              <w:spacing w:after="40" w:line="252"/>
+            </w:pPr>
+            <w:r>
+              <w:rPr>
+                <w:sz w:val="18"/>
+                <w:szCs w:val="18"/>
+              </w:rPr>
+              <w:t xml:space="preserve">Refused</w:t>
+            </w:r>
+          </w:p>
+        </w:tc>
+        <w:tc>
+          <w:tcPr>
+            <w:tcW w:type="dxa" w:w="1700"/>
+            <w:tcBorders>
+              <w:top w:val="single" w:color="D9D2C3" w:sz="4"/>
+              <w:left w:val="single" w:color="D9D2C3" w:sz="4"/>
+              <w:bottom w:val="single" w:color="D9D2C3" w:sz="4"/>
+              <w:right w:val="single" w:color="D9D2C3" w:sz="4"/>
+            </w:tcBorders>
+            <w:shd w:fill="FBF8F1" w:color="auto" w:val="clear"/>
+            <w:tcMar>
+              <w:top w:type="dxa" w:w="70"/>
+              <w:left w:type="dxa" w:w="100"/>
+              <w:bottom w:type="dxa" w:w="50"/>
+              <w:right w:type="dxa" w:w="100"/>
+            </w:tcMar>
+          </w:tcPr>
+          <w:p>
+            <w:pPr>
+              <w:spacing w:after="40" w:line="252"/>
+            </w:pPr>
+            <w:r>
+              <w:rPr>
+                <w:sz w:val="18"/>
+                <w:szCs w:val="18"/>
+              </w:rPr>
+              <w:t xml:space="preserve">Negative</w:t>
+            </w:r>
+          </w:p>
+        </w:tc>
+      </w:tr>
+      <w:tr>
+        <w:trPr>
+          <w:cantSplit/>
+        </w:trPr>
+        <w:tc>
+          <w:tcPr>
+            <w:tcW w:type="dxa" w:w="4300"/>
+            <w:tcBorders>
+              <w:top w:val="single" w:color="D9D2C3" w:sz="4"/>
+              <w:left w:val="single" w:color="D9D2C3" w:sz="4"/>
+              <w:bottom w:val="single" w:color="D9D2C3" w:sz="4"/>
+              <w:right w:val="single" w:color="D9D2C3" w:sz="4"/>
+            </w:tcBorders>
+            <w:tcMar>
+              <w:top w:type="dxa" w:w="70"/>
+              <w:left w:type="dxa" w:w="100"/>
+              <w:bottom w:type="dxa" w:w="50"/>
+              <w:right w:type="dxa" w:w="100"/>
+            </w:tcMar>
+          </w:tcPr>
+          <w:p>
+            <w:pPr>
+              <w:spacing w:after="40" w:line="252"/>
+            </w:pPr>
+            <w:r>
+              <w:rPr>
+                <w:sz w:val="18"/>
+                <w:szCs w:val="18"/>
+              </w:rPr>
+              <w:t xml:space="preserve">Move a missed booking to a full, past, other-centre or passport slot</w:t>
+            </w:r>
+          </w:p>
+        </w:tc>
+        <w:tc>
+          <w:tcPr>
+            <w:tcW w:type="dxa" w:w="3638"/>
+            <w:tcBorders>
+              <w:top w:val="single" w:color="D9D2C3" w:sz="4"/>
+              <w:left w:val="single" w:color="D9D2C3" w:sz="4"/>
+              <w:bottom w:val="single" w:color="D9D2C3" w:sz="4"/>
+              <w:right w:val="single" w:color="D9D2C3" w:sz="4"/>
+            </w:tcBorders>
+            <w:tcMar>
+              <w:top w:type="dxa" w:w="70"/>
+              <w:left w:type="dxa" w:w="100"/>
+              <w:bottom w:type="dxa" w:w="50"/>
+              <w:right w:type="dxa" w:w="100"/>
+            </w:tcMar>
+          </w:tcPr>
+          <w:p>
+            <w:pPr>
+              <w:spacing w:after="40" w:line="252"/>
+            </w:pPr>
+            <w:r>
+              <w:rPr>
+                <w:sz w:val="18"/>
+                <w:szCs w:val="18"/>
+              </w:rPr>
+              <w:t xml:space="preserve">Each one is refused</w:t>
+            </w:r>
+          </w:p>
+        </w:tc>
+        <w:tc>
+          <w:tcPr>
+            <w:tcW w:type="dxa" w:w="1700"/>
+            <w:tcBorders>
+              <w:top w:val="single" w:color="D9D2C3" w:sz="4"/>
+              <w:left w:val="single" w:color="D9D2C3" w:sz="4"/>
+              <w:bottom w:val="single" w:color="D9D2C3" w:sz="4"/>
+              <w:right w:val="single" w:color="D9D2C3" w:sz="4"/>
+            </w:tcBorders>
+            <w:tcMar>
+              <w:top w:type="dxa" w:w="70"/>
+              <w:left w:type="dxa" w:w="100"/>
+              <w:bottom w:type="dxa" w:w="50"/>
+              <w:right w:type="dxa" w:w="100"/>
+            </w:tcMar>
+          </w:tcPr>
+          <w:p>
+            <w:pPr>
+              <w:spacing w:after="40" w:line="252"/>
+            </w:pPr>
+            <w:r>
+              <w:rPr>
+                <w:sz w:val="18"/>
+                <w:szCs w:val="18"/>
+              </w:rPr>
+              <w:t xml:space="preserve">Equivalence classes</w:t>
+            </w:r>
+          </w:p>
+        </w:tc>
+      </w:tr>
+      <w:tr>
+        <w:trPr>
+          <w:cantSplit/>
+        </w:trPr>
+        <w:tc>
+          <w:tcPr>
+            <w:tcW w:type="dxa" w:w="4300"/>
+            <w:tcBorders>
+              <w:top w:val="single" w:color="D9D2C3" w:sz="4"/>
+              <w:left w:val="single" w:color="D9D2C3" w:sz="4"/>
+              <w:bottom w:val="single" w:color="D9D2C3" w:sz="4"/>
+              <w:right w:val="single" w:color="D9D2C3" w:sz="4"/>
+            </w:tcBorders>
+            <w:shd w:fill="FBF8F1" w:color="auto" w:val="clear"/>
+            <w:tcMar>
+              <w:top w:type="dxa" w:w="70"/>
+              <w:left w:type="dxa" w:w="100"/>
+              <w:bottom w:type="dxa" w:w="50"/>
+              <w:right w:type="dxa" w:w="100"/>
+            </w:tcMar>
+          </w:tcPr>
+          <w:p>
+            <w:pPr>
+              <w:spacing w:after="40" w:line="252"/>
+            </w:pPr>
+            <w:r>
+              <w:rPr>
+                <w:sz w:val="18"/>
+                <w:szCs w:val="18"/>
+              </w:rPr>
+              <w:t xml:space="preserve">Move a missed booking to a valid slot</w:t>
+            </w:r>
+          </w:p>
+        </w:tc>
+        <w:tc>
+          <w:tcPr>
+            <w:tcW w:type="dxa" w:w="3638"/>
+            <w:tcBorders>
+              <w:top w:val="single" w:color="D9D2C3" w:sz="4"/>
+              <w:left w:val="single" w:color="D9D2C3" w:sz="4"/>
+              <w:bottom w:val="single" w:color="D9D2C3" w:sz="4"/>
+              <w:right w:val="single" w:color="D9D2C3" w:sz="4"/>
+            </w:tcBorders>
+            <w:shd w:fill="FBF8F1" w:color="auto" w:val="clear"/>
+            <w:tcMar>
+              <w:top w:type="dxa" w:w="70"/>
+              <w:left w:type="dxa" w:w="100"/>
+              <w:bottom w:type="dxa" w:w="50"/>
+              <w:right w:type="dxa" w:w="100"/>
+            </w:tcMar>
+          </w:tcPr>
+          <w:p>
+            <w:pPr>
+              <w:spacing w:after="40" w:line="252"/>
+            </w:pPr>
+            <w:r>
+              <w:rPr>
+                <w:sz w:val="18"/>
+                <w:szCs w:val="18"/>
+              </w:rPr>
+              <w:t xml:space="preserve">Booking moves, the same QR stays valid</w:t>
+            </w:r>
+          </w:p>
+        </w:tc>
+        <w:tc>
+          <w:tcPr>
+            <w:tcW w:type="dxa" w:w="1700"/>
+            <w:tcBorders>
+              <w:top w:val="single" w:color="D9D2C3" w:sz="4"/>
+              <w:left w:val="single" w:color="D9D2C3" w:sz="4"/>
+              <w:bottom w:val="single" w:color="D9D2C3" w:sz="4"/>
+              <w:right w:val="single" w:color="D9D2C3" w:sz="4"/>
+            </w:tcBorders>
+            <w:shd w:fill="FBF8F1" w:color="auto" w:val="clear"/>
+            <w:tcMar>
+              <w:top w:type="dxa" w:w="70"/>
+              <w:left w:type="dxa" w:w="100"/>
+              <w:bottom w:type="dxa" w:w="50"/>
+              <w:right w:type="dxa" w:w="100"/>
+            </w:tcMar>
+          </w:tcPr>
+          <w:p>
+            <w:pPr>
+              <w:spacing w:after="40" w:line="252"/>
+            </w:pPr>
+            <w:r>
+              <w:rPr>
+                <w:sz w:val="18"/>
+                <w:szCs w:val="18"/>
+              </w:rPr>
+              <w:t xml:space="preserve">Valid class</w:t>
+            </w:r>
+          </w:p>
+        </w:tc>
+      </w:tr>
+      <w:tr>
+        <w:trPr>
+          <w:cantSplit/>
+        </w:trPr>
+        <w:tc>
+          <w:tcPr>
+            <w:tcW w:type="dxa" w:w="4300"/>
+            <w:tcBorders>
+              <w:top w:val="single" w:color="D9D2C3" w:sz="4"/>
+              <w:left w:val="single" w:color="D9D2C3" w:sz="4"/>
+              <w:bottom w:val="single" w:color="D9D2C3" w:sz="4"/>
+              <w:right w:val="single" w:color="D9D2C3" w:sz="4"/>
+            </w:tcBorders>
+            <w:tcMar>
+              <w:top w:type="dxa" w:w="70"/>
+              <w:left w:type="dxa" w:w="100"/>
+              <w:bottom w:type="dxa" w:w="50"/>
+              <w:right w:type="dxa" w:w="100"/>
+            </w:tcMar>
+          </w:tcPr>
+          <w:p>
+            <w:pPr>
+              <w:spacing w:after="40" w:line="252"/>
+            </w:pPr>
+            <w:r>
+              <w:rPr>
+                <w:sz w:val="18"/>
+                <w:szCs w:val="18"/>
+              </w:rPr>
+              <w:t xml:space="preserve">POST with a forged or missing form token</w:t>
+            </w:r>
+          </w:p>
+        </w:tc>
+        <w:tc>
+          <w:tcPr>
+            <w:tcW w:type="dxa" w:w="3638"/>
+            <w:tcBorders>
+              <w:top w:val="single" w:color="D9D2C3" w:sz="4"/>
+              <w:left w:val="single" w:color="D9D2C3" w:sz="4"/>
+              <w:bottom w:val="single" w:color="D9D2C3" w:sz="4"/>
+              <w:right w:val="single" w:color="D9D2C3" w:sz="4"/>
+            </w:tcBorders>
+            <w:tcMar>
+              <w:top w:type="dxa" w:w="70"/>
+              <w:left w:type="dxa" w:w="100"/>
+              <w:bottom w:type="dxa" w:w="50"/>
+              <w:right w:type="dxa" w:w="100"/>
+            </w:tcMar>
+          </w:tcPr>
+          <w:p>
+            <w:pPr>
+              <w:spacing w:after="40" w:line="252"/>
+            </w:pPr>
+            <w:r>
+              <w:rPr>
+                <w:sz w:val="18"/>
+                <w:szCs w:val="18"/>
+              </w:rPr>
+              <w:t xml:space="preserve">"Reload the page and try again." and the service is never called</w:t>
+            </w:r>
+          </w:p>
+        </w:tc>
+        <w:tc>
+          <w:tcPr>
+            <w:tcW w:type="dxa" w:w="1700"/>
+            <w:tcBorders>
+              <w:top w:val="single" w:color="D9D2C3" w:sz="4"/>
+              <w:left w:val="single" w:color="D9D2C3" w:sz="4"/>
+              <w:bottom w:val="single" w:color="D9D2C3" w:sz="4"/>
+              <w:right w:val="single" w:color="D9D2C3" w:sz="4"/>
+            </w:tcBorders>
+            <w:tcMar>
+              <w:top w:type="dxa" w:w="70"/>
+              <w:left w:type="dxa" w:w="100"/>
+              <w:bottom w:type="dxa" w:w="50"/>
+              <w:right w:type="dxa" w:w="100"/>
+            </w:tcMar>
+          </w:tcPr>
+          <w:p>
+            <w:pPr>
+              <w:spacing w:after="40" w:line="252"/>
+            </w:pPr>
+            <w:r>
+              <w:rPr>
+                <w:sz w:val="18"/>
+                <w:szCs w:val="18"/>
+              </w:rPr>
+              <w:t xml:space="preserve">Security</w:t>
+            </w:r>
+          </w:p>
+        </w:tc>
+      </w:tr>
+      <w:tr>
+        <w:trPr>
+          <w:cantSplit/>
+        </w:trPr>
+        <w:tc>
+          <w:tcPr>
+            <w:tcW w:type="dxa" w:w="4300"/>
+            <w:tcBorders>
+              <w:top w:val="single" w:color="D9D2C3" w:sz="4"/>
+              <w:left w:val="single" w:color="D9D2C3" w:sz="4"/>
+              <w:bottom w:val="single" w:color="D9D2C3" w:sz="4"/>
+              <w:right w:val="single" w:color="D9D2C3" w:sz="4"/>
+            </w:tcBorders>
+            <w:shd w:fill="FBF8F1" w:color="auto" w:val="clear"/>
+            <w:tcMar>
+              <w:top w:type="dxa" w:w="70"/>
+              <w:left w:type="dxa" w:w="100"/>
+              <w:bottom w:type="dxa" w:w="50"/>
+              <w:right w:type="dxa" w:w="100"/>
+            </w:tcMar>
+          </w:tcPr>
+          <w:p>
+            <w:pPr>
+              <w:spacing w:after="40" w:line="252"/>
+            </w:pPr>
+            <w:r>
+              <w:rPr>
+                <w:sz w:val="18"/>
+                <w:szCs w:val="18"/>
+              </w:rPr>
+              <w:t xml:space="preserve">Officer of the other service opens the desk or schedule</w:t>
+            </w:r>
+          </w:p>
+        </w:tc>
+        <w:tc>
+          <w:tcPr>
+            <w:tcW w:type="dxa" w:w="3638"/>
+            <w:tcBorders>
+              <w:top w:val="single" w:color="D9D2C3" w:sz="4"/>
+              <w:left w:val="single" w:color="D9D2C3" w:sz="4"/>
+              <w:bottom w:val="single" w:color="D9D2C3" w:sz="4"/>
+              <w:right w:val="single" w:color="D9D2C3" w:sz="4"/>
+            </w:tcBorders>
+            <w:shd w:fill="FBF8F1" w:color="auto" w:val="clear"/>
+            <w:tcMar>
+              <w:top w:type="dxa" w:w="70"/>
+              <w:left w:type="dxa" w:w="100"/>
+              <w:bottom w:type="dxa" w:w="50"/>
+              <w:right w:type="dxa" w:w="100"/>
+            </w:tcMar>
+          </w:tcPr>
+          <w:p>
+            <w:pPr>
+              <w:spacing w:after="40" w:line="252"/>
+            </w:pPr>
+            <w:r>
+              <w:rPr>
+                <w:sz w:val="18"/>
+                <w:szCs w:val="18"/>
+              </w:rPr>
+              <w:t xml:space="preserve">Sent to login</w:t>
+            </w:r>
+          </w:p>
+        </w:tc>
+        <w:tc>
+          <w:tcPr>
+            <w:tcW w:type="dxa" w:w="1700"/>
+            <w:tcBorders>
+              <w:top w:val="single" w:color="D9D2C3" w:sz="4"/>
+              <w:left w:val="single" w:color="D9D2C3" w:sz="4"/>
+              <w:bottom w:val="single" w:color="D9D2C3" w:sz="4"/>
+              <w:right w:val="single" w:color="D9D2C3" w:sz="4"/>
+            </w:tcBorders>
+            <w:shd w:fill="FBF8F1" w:color="auto" w:val="clear"/>
+            <w:tcMar>
+              <w:top w:type="dxa" w:w="70"/>
+              <w:left w:type="dxa" w:w="100"/>
+              <w:bottom w:type="dxa" w:w="50"/>
+              <w:right w:type="dxa" w:w="100"/>
+            </w:tcMar>
+          </w:tcPr>
+          <w:p>
+            <w:pPr>
+              <w:spacing w:after="40" w:line="252"/>
+            </w:pPr>
+            <w:r>
+              <w:rPr>
+                <w:sz w:val="18"/>
+                <w:szCs w:val="18"/>
+              </w:rPr>
+              <w:t xml:space="preserve">Security</w:t>
+            </w:r>
+          </w:p>
+        </w:tc>
+      </w:tr>
+      <w:tr>
+        <w:trPr>
+          <w:cantSplit/>
+        </w:trPr>
+        <w:tc>
+          <w:tcPr>
+            <w:tcW w:type="dxa" w:w="4300"/>
+            <w:tcBorders>
+              <w:top w:val="single" w:color="D9D2C3" w:sz="4"/>
+              <w:left w:val="single" w:color="D9D2C3" w:sz="4"/>
+              <w:bottom w:val="single" w:color="D9D2C3" w:sz="4"/>
+              <w:right w:val="single" w:color="D9D2C3" w:sz="4"/>
+            </w:tcBorders>
+            <w:tcMar>
+              <w:top w:type="dxa" w:w="70"/>
+              <w:left w:type="dxa" w:w="100"/>
+              <w:bottom w:type="dxa" w:w="50"/>
+              <w:right w:type="dxa" w:w="100"/>
+            </w:tcMar>
+          </w:tcPr>
+          <w:p>
+            <w:pPr>
+              <w:spacing w:after="40" w:line="252"/>
+            </w:pPr>
+            <w:r>
+              <w:rPr>
+                <w:sz w:val="18"/>
+                <w:szCs w:val="18"/>
+              </w:rPr>
+              <w:t xml:space="preserve">Unknown service in the URL, or a slot id that is not a number</w:t>
+            </w:r>
+          </w:p>
+        </w:tc>
+        <w:tc>
+          <w:tcPr>
+            <w:tcW w:type="dxa" w:w="3638"/>
+            <w:tcBorders>
+              <w:top w:val="single" w:color="D9D2C3" w:sz="4"/>
+              <w:left w:val="single" w:color="D9D2C3" w:sz="4"/>
+              <w:bottom w:val="single" w:color="D9D2C3" w:sz="4"/>
+              <w:right w:val="single" w:color="D9D2C3" w:sz="4"/>
+            </w:tcBorders>
+            <w:tcMar>
+              <w:top w:type="dxa" w:w="70"/>
+              <w:left w:type="dxa" w:w="100"/>
+              <w:bottom w:type="dxa" w:w="50"/>
+              <w:right w:type="dxa" w:w="100"/>
+            </w:tcMar>
+          </w:tcPr>
+          <w:p>
+            <w:pPr>
+              <w:spacing w:after="40" w:line="252"/>
+            </w:pPr>
+            <w:r>
+              <w:rPr>
+                <w:sz w:val="18"/>
+                <w:szCs w:val="18"/>
+              </w:rPr>
+              <w:t xml:space="preserve">HTTP 404, or a friendly message</w:t>
+            </w:r>
+          </w:p>
+        </w:tc>
+        <w:tc>
+          <w:tcPr>
+            <w:tcW w:type="dxa" w:w="1700"/>
+            <w:tcBorders>
+              <w:top w:val="single" w:color="D9D2C3" w:sz="4"/>
+              <w:left w:val="single" w:color="D9D2C3" w:sz="4"/>
+              <w:bottom w:val="single" w:color="D9D2C3" w:sz="4"/>
+              <w:right w:val="single" w:color="D9D2C3" w:sz="4"/>
+            </w:tcBorders>
+            <w:tcMar>
+              <w:top w:type="dxa" w:w="70"/>
+              <w:left w:type="dxa" w:w="100"/>
+              <w:bottom w:type="dxa" w:w="50"/>
+              <w:right w:type="dxa" w:w="100"/>
+            </w:tcMar>
+          </w:tcPr>
+          <w:p>
+            <w:pPr>
+              <w:spacing w:after="40" w:line="252"/>
+            </w:pPr>
+            <w:r>
+              <w:rPr>
+                <w:sz w:val="18"/>
+                <w:szCs w:val="18"/>
+              </w:rPr>
+              <w:t xml:space="preserve">Negative</w:t>
+            </w:r>
+          </w:p>
+        </w:tc>
+      </w:tr>
+      <w:tr>
+        <w:trPr>
+          <w:cantSplit/>
+        </w:trPr>
+        <w:tc>
+          <w:tcPr>
+            <w:tcW w:type="dxa" w:w="4300"/>
+            <w:tcBorders>
+              <w:top w:val="single" w:color="D9D2C3" w:sz="4"/>
+              <w:left w:val="single" w:color="D9D2C3" w:sz="4"/>
+              <w:bottom w:val="single" w:color="D9D2C3" w:sz="4"/>
+              <w:right w:val="single" w:color="D9D2C3" w:sz="4"/>
+            </w:tcBorders>
+            <w:shd w:fill="FBF8F1" w:color="auto" w:val="clear"/>
+            <w:tcMar>
+              <w:top w:type="dxa" w:w="70"/>
+              <w:left w:type="dxa" w:w="100"/>
+              <w:bottom w:type="dxa" w:w="50"/>
+              <w:right w:type="dxa" w:w="100"/>
+            </w:tcMar>
+          </w:tcPr>
+          <w:p>
+            <w:pPr>
+              <w:spacing w:after="40" w:line="252"/>
+            </w:pPr>
+            <w:r>
+              <w:rPr>
+                <w:sz w:val="18"/>
+                <w:szCs w:val="18"/>
+              </w:rPr>
+              <w:t xml:space="preserve">Database conflict while saving</w:t>
+            </w:r>
+          </w:p>
+        </w:tc>
+        <w:tc>
+          <w:tcPr>
+            <w:tcW w:type="dxa" w:w="3638"/>
+            <w:tcBorders>
+              <w:top w:val="single" w:color="D9D2C3" w:sz="4"/>
+              <w:left w:val="single" w:color="D9D2C3" w:sz="4"/>
+              <w:bottom w:val="single" w:color="D9D2C3" w:sz="4"/>
+              <w:right w:val="single" w:color="D9D2C3" w:sz="4"/>
+            </w:tcBorders>
+            <w:shd w:fill="FBF8F1" w:color="auto" w:val="clear"/>
+            <w:tcMar>
+              <w:top w:type="dxa" w:w="70"/>
+              <w:left w:type="dxa" w:w="100"/>
+              <w:bottom w:type="dxa" w:w="50"/>
+              <w:right w:type="dxa" w:w="100"/>
+            </w:tcMar>
+          </w:tcPr>
+          <w:p>
+            <w:pPr>
+              <w:spacing w:after="40" w:line="252"/>
+            </w:pPr>
+            <w:r>
+              <w:rPr>
+                <w:sz w:val="18"/>
+                <w:szCs w:val="18"/>
+              </w:rPr>
+              <w:t xml:space="preserve">Friendly message, no error page</w:t>
+            </w:r>
+          </w:p>
+        </w:tc>
+        <w:tc>
+          <w:tcPr>
+            <w:tcW w:type="dxa" w:w="1700"/>
+            <w:tcBorders>
+              <w:top w:val="single" w:color="D9D2C3" w:sz="4"/>
+              <w:left w:val="single" w:color="D9D2C3" w:sz="4"/>
+              <w:bottom w:val="single" w:color="D9D2C3" w:sz="4"/>
+              <w:right w:val="single" w:color="D9D2C3" w:sz="4"/>
+            </w:tcBorders>
+            <w:shd w:fill="FBF8F1" w:color="auto" w:val="clear"/>
+            <w:tcMar>
+              <w:top w:type="dxa" w:w="70"/>
+              <w:left w:type="dxa" w:w="100"/>
+              <w:bottom w:type="dxa" w:w="50"/>
+              <w:right w:type="dxa" w:w="100"/>
+            </w:tcMar>
+          </w:tcPr>
+          <w:p>
+            <w:pPr>
+              <w:spacing w:after="40" w:line="252"/>
+            </w:pPr>
+            <w:r>
+              <w:rPr>
+                <w:sz w:val="18"/>
+                <w:szCs w:val="18"/>
+              </w:rPr>
+              <w:t xml:space="preserve">Exception handling</w:t>
+            </w:r>
+          </w:p>
+        </w:tc>
+      </w:tr>
+      <w:tr>
+        <w:trPr>
+          <w:cantSplit/>
+        </w:trPr>
+        <w:tc>
+          <w:tcPr>
+            <w:tcW w:type="dxa" w:w="4300"/>
+            <w:tcBorders>
+              <w:top w:val="single" w:color="D9D2C3" w:sz="4"/>
+              <w:left w:val="single" w:color="D9D2C3" w:sz="4"/>
+              <w:bottom w:val="single" w:color="D9D2C3" w:sz="4"/>
+              <w:right w:val="single" w:color="D9D2C3" w:sz="4"/>
+            </w:tcBorders>
+            <w:tcMar>
+              <w:top w:type="dxa" w:w="70"/>
+              <w:left w:type="dxa" w:w="100"/>
+              <w:bottom w:type="dxa" w:w="50"/>
+              <w:right w:type="dxa" w:w="100"/>
+            </w:tcMar>
+          </w:tcPr>
+          <w:p>
+            <w:pPr>
+              <w:spacing w:after="40" w:line="252"/>
+            </w:pPr>
+            <w:r>
+              <w:rPr>
+                <w:sz w:val="18"/>
+                <w:szCs w:val="18"/>
+              </w:rPr>
+              <w:t xml:space="preserve">Officer closes a day</w:t>
+            </w:r>
+          </w:p>
+        </w:tc>
+        <w:tc>
+          <w:tcPr>
+            <w:tcW w:type="dxa" w:w="3638"/>
+            <w:tcBorders>
+              <w:top w:val="single" w:color="D9D2C3" w:sz="4"/>
+              <w:left w:val="single" w:color="D9D2C3" w:sz="4"/>
+              <w:bottom w:val="single" w:color="D9D2C3" w:sz="4"/>
+              <w:right w:val="single" w:color="D9D2C3" w:sz="4"/>
+            </w:tcBorders>
+            <w:tcMar>
+              <w:top w:type="dxa" w:w="70"/>
+              <w:left w:type="dxa" w:w="100"/>
+              <w:bottom w:type="dxa" w:w="50"/>
+              <w:right w:type="dxa" w:w="100"/>
+            </w:tcMar>
+          </w:tcPr>
+          <w:p>
+            <w:pPr>
+              <w:spacing w:after="40" w:line="252"/>
+            </w:pPr>
+            <w:r>
+              <w:rPr>
+                <w:sz w:val="18"/>
+                <w:szCs w:val="18"/>
+              </w:rPr>
+              <w:t xml:space="preserve">Confirmed bookings are cancelled, checked-in ones are kept</w:t>
+            </w:r>
+          </w:p>
+        </w:tc>
+        <w:tc>
+          <w:tcPr>
+            <w:tcW w:type="dxa" w:w="1700"/>
+            <w:tcBorders>
+              <w:top w:val="single" w:color="D9D2C3" w:sz="4"/>
+              <w:left w:val="single" w:color="D9D2C3" w:sz="4"/>
+              <w:bottom w:val="single" w:color="D9D2C3" w:sz="4"/>
+              <w:right w:val="single" w:color="D9D2C3" w:sz="4"/>
+            </w:tcBorders>
+            <w:tcMar>
+              <w:top w:type="dxa" w:w="70"/>
+              <w:left w:type="dxa" w:w="100"/>
+              <w:bottom w:type="dxa" w:w="50"/>
+              <w:right w:type="dxa" w:w="100"/>
+            </w:tcMar>
+          </w:tcPr>
+          <w:p>
+            <w:pPr>
+              <w:spacing w:after="40" w:line="252"/>
+            </w:pPr>
+            <w:r>
+              <w:rPr>
+                <w:sz w:val="18"/>
+                <w:szCs w:val="18"/>
+              </w:rPr>
+              <w:t xml:space="preserve">Workflow</w:t>
+            </w:r>
+          </w:p>
+        </w:tc>
+      </w:tr>
+      <w:tr>
+        <w:trPr>
+          <w:cantSplit/>
+        </w:trPr>
+        <w:tc>
+          <w:tcPr>
+            <w:tcW w:type="dxa" w:w="4300"/>
+            <w:tcBorders>
+              <w:top w:val="single" w:color="D9D2C3" w:sz="4"/>
+              <w:left w:val="single" w:color="D9D2C3" w:sz="4"/>
+              <w:bottom w:val="single" w:color="D9D2C3" w:sz="4"/>
+              <w:right w:val="single" w:color="D9D2C3" w:sz="4"/>
+            </w:tcBorders>
+            <w:shd w:fill="FBF8F1" w:color="auto" w:val="clear"/>
+            <w:tcMar>
+              <w:top w:type="dxa" w:w="70"/>
+              <w:left w:type="dxa" w:w="100"/>
+              <w:bottom w:type="dxa" w:w="50"/>
+              <w:right w:type="dxa" w:w="100"/>
+            </w:tcMar>
+          </w:tcPr>
+          <w:p>
+            <w:pPr>
+              <w:spacing w:after="40" w:line="252"/>
+            </w:pPr>
+            <w:r>
+              <w:rPr>
+                <w:sz w:val="18"/>
+                <w:szCs w:val="18"/>
+              </w:rPr>
+              <w:t xml:space="preserve">Delete a slot that is in the past or was ever booked</w:t>
+            </w:r>
+          </w:p>
+        </w:tc>
+        <w:tc>
+          <w:tcPr>
+            <w:tcW w:type="dxa" w:w="3638"/>
+            <w:tcBorders>
+              <w:top w:val="single" w:color="D9D2C3" w:sz="4"/>
+              <w:left w:val="single" w:color="D9D2C3" w:sz="4"/>
+              <w:bottom w:val="single" w:color="D9D2C3" w:sz="4"/>
+              <w:right w:val="single" w:color="D9D2C3" w:sz="4"/>
+            </w:tcBorders>
+            <w:shd w:fill="FBF8F1" w:color="auto" w:val="clear"/>
+            <w:tcMar>
+              <w:top w:type="dxa" w:w="70"/>
+              <w:left w:type="dxa" w:w="100"/>
+              <w:bottom w:type="dxa" w:w="50"/>
+              <w:right w:type="dxa" w:w="100"/>
+            </w:tcMar>
+          </w:tcPr>
+          <w:p>
+            <w:pPr>
+              <w:spacing w:after="40" w:line="252"/>
+            </w:pPr>
+            <w:r>
+              <w:rPr>
+                <w:sz w:val="18"/>
+                <w:szCs w:val="18"/>
+              </w:rPr>
+              <w:t xml:space="preserve">Refused. Only future, never-booked slots are deleted</w:t>
+            </w:r>
+          </w:p>
+        </w:tc>
+        <w:tc>
+          <w:tcPr>
+            <w:tcW w:type="dxa" w:w="1700"/>
+            <w:tcBorders>
+              <w:top w:val="single" w:color="D9D2C3" w:sz="4"/>
+              <w:left w:val="single" w:color="D9D2C3" w:sz="4"/>
+              <w:bottom w:val="single" w:color="D9D2C3" w:sz="4"/>
+              <w:right w:val="single" w:color="D9D2C3" w:sz="4"/>
+            </w:tcBorders>
+            <w:shd w:fill="FBF8F1" w:color="auto" w:val="clear"/>
+            <w:tcMar>
+              <w:top w:type="dxa" w:w="70"/>
+              <w:left w:type="dxa" w:w="100"/>
+              <w:bottom w:type="dxa" w:w="50"/>
+              <w:right w:type="dxa" w:w="100"/>
+            </w:tcMar>
+          </w:tcPr>
+          <w:p>
+            <w:pPr>
+              <w:spacing w:after="40" w:line="252"/>
+            </w:pPr>
+            <w:r>
+              <w:rPr>
+                <w:sz w:val="18"/>
+                <w:szCs w:val="18"/>
+              </w:rPr>
+              <w:t xml:space="preserve">Equivalence classes</w:t>
+            </w:r>
+          </w:p>
+        </w:tc>
+      </w:tr>
+      <w:tr>
+        <w:trPr>
+          <w:cantSplit/>
+        </w:trPr>
+        <w:tc>
+          <w:tcPr>
+            <w:tcW w:type="dxa" w:w="4300"/>
+            <w:tcBorders>
+              <w:top w:val="single" w:color="D9D2C3" w:sz="4"/>
+              <w:left w:val="single" w:color="D9D2C3" w:sz="4"/>
+              <w:bottom w:val="single" w:color="D9D2C3" w:sz="4"/>
+              <w:right w:val="single" w:color="D9D2C3" w:sz="4"/>
+            </w:tcBorders>
+            <w:tcMar>
+              <w:top w:type="dxa" w:w="70"/>
+              <w:left w:type="dxa" w:w="100"/>
+              <w:bottom w:type="dxa" w:w="50"/>
+              <w:right w:type="dxa" w:w="100"/>
+            </w:tcMar>
+          </w:tcPr>
+          <w:p>
+            <w:pPr>
+              <w:spacing w:after="40" w:line="252"/>
+            </w:pPr>
+            <w:r>
+              <w:rPr>
+                <w:sz w:val="18"/>
+                <w:szCs w:val="18"/>
+              </w:rPr>
+              <w:t xml:space="preserve">Cancel a booking, then book again</w:t>
+            </w:r>
+          </w:p>
+        </w:tc>
+        <w:tc>
+          <w:tcPr>
+            <w:tcW w:type="dxa" w:w="3638"/>
+            <w:tcBorders>
+              <w:top w:val="single" w:color="D9D2C3" w:sz="4"/>
+              <w:left w:val="single" w:color="D9D2C3" w:sz="4"/>
+              <w:bottom w:val="single" w:color="D9D2C3" w:sz="4"/>
+              <w:right w:val="single" w:color="D9D2C3" w:sz="4"/>
+            </w:tcBorders>
+            <w:tcMar>
+              <w:top w:type="dxa" w:w="70"/>
+              <w:left w:type="dxa" w:w="100"/>
+              <w:bottom w:type="dxa" w:w="50"/>
+              <w:right w:type="dxa" w:w="100"/>
+            </w:tcMar>
+          </w:tcPr>
+          <w:p>
+            <w:pPr>
+              <w:spacing w:after="40" w:line="252"/>
+            </w:pPr>
+            <w:r>
+              <w:rPr>
+                <w:sz w:val="18"/>
+                <w:szCs w:val="18"/>
+              </w:rPr>
+              <w:t xml:space="preserve">Rebooks with no second payment</w:t>
+            </w:r>
+          </w:p>
+        </w:tc>
+        <w:tc>
+          <w:tcPr>
+            <w:tcW w:type="dxa" w:w="1700"/>
+            <w:tcBorders>
+              <w:top w:val="single" w:color="D9D2C3" w:sz="4"/>
+              <w:left w:val="single" w:color="D9D2C3" w:sz="4"/>
+              <w:bottom w:val="single" w:color="D9D2C3" w:sz="4"/>
+              <w:right w:val="single" w:color="D9D2C3" w:sz="4"/>
+            </w:tcBorders>
+            <w:tcMar>
+              <w:top w:type="dxa" w:w="70"/>
+              <w:left w:type="dxa" w:w="100"/>
+              <w:bottom w:type="dxa" w:w="50"/>
+              <w:right w:type="dxa" w:w="100"/>
+            </w:tcMar>
+          </w:tcPr>
+          <w:p>
+            <w:pPr>
+              <w:spacing w:after="40" w:line="252"/>
+            </w:pPr>
+            <w:r>
+              <w:rPr>
+                <w:sz w:val="18"/>
+                <w:szCs w:val="18"/>
+              </w:rPr>
+              <w:t xml:space="preserve">Workflow</w:t>
+            </w:r>
+          </w:p>
+        </w:tc>
+      </w:tr>
+      <w:tr>
+        <w:trPr>
+          <w:cantSplit/>
+        </w:trPr>
+        <w:tc>
+          <w:tcPr>
+            <w:tcW w:type="dxa" w:w="4300"/>
+            <w:tcBorders>
+              <w:top w:val="single" w:color="D9D2C3" w:sz="4"/>
+              <w:left w:val="single" w:color="D9D2C3" w:sz="4"/>
+              <w:bottom w:val="single" w:color="D9D2C3" w:sz="4"/>
+              <w:right w:val="single" w:color="D9D2C3" w:sz="4"/>
+            </w:tcBorders>
+            <w:shd w:fill="FBF8F1" w:color="auto" w:val="clear"/>
+            <w:tcMar>
+              <w:top w:type="dxa" w:w="70"/>
+              <w:left w:type="dxa" w:w="100"/>
+              <w:bottom w:type="dxa" w:w="50"/>
+              <w:right w:type="dxa" w:w="100"/>
+            </w:tcMar>
+          </w:tcPr>
+          <w:p>
+            <w:pPr>
+              <w:spacing w:after="40" w:line="252"/>
+            </w:pPr>
+            <w:r>
+              <w:rPr>
+                <w:sz w:val="18"/>
+                <w:szCs w:val="18"/>
+              </w:rPr>
+              <w:t xml:space="preserve">Pay, book, scan the QR, check in, collect (NIC and passport)</w:t>
+            </w:r>
+          </w:p>
+        </w:tc>
+        <w:tc>
+          <w:tcPr>
+            <w:tcW w:type="dxa" w:w="3638"/>
+            <w:tcBorders>
+              <w:top w:val="single" w:color="D9D2C3" w:sz="4"/>
+              <w:left w:val="single" w:color="D9D2C3" w:sz="4"/>
+              <w:bottom w:val="single" w:color="D9D2C3" w:sz="4"/>
+              <w:right w:val="single" w:color="D9D2C3" w:sz="4"/>
+            </w:tcBorders>
+            <w:shd w:fill="FBF8F1" w:color="auto" w:val="clear"/>
+            <w:tcMar>
+              <w:top w:type="dxa" w:w="70"/>
+              <w:left w:type="dxa" w:w="100"/>
+              <w:bottom w:type="dxa" w:w="50"/>
+              <w:right w:type="dxa" w:w="100"/>
+            </w:tcMar>
+          </w:tcPr>
+          <w:p>
+            <w:pPr>
+              <w:spacing w:after="40" w:line="252"/>
+            </w:pPr>
+            <w:r>
+              <w:rPr>
+                <w:sz w:val="18"/>
+                <w:szCs w:val="18"/>
+              </w:rPr>
+              <w:t xml:space="preserve">Application becomes ready for printing</w:t>
+            </w:r>
+          </w:p>
+        </w:tc>
+        <w:tc>
+          <w:tcPr>
+            <w:tcW w:type="dxa" w:w="1700"/>
+            <w:tcBorders>
+              <w:top w:val="single" w:color="D9D2C3" w:sz="4"/>
+              <w:left w:val="single" w:color="D9D2C3" w:sz="4"/>
+              <w:bottom w:val="single" w:color="D9D2C3" w:sz="4"/>
+              <w:right w:val="single" w:color="D9D2C3" w:sz="4"/>
+            </w:tcBorders>
+            <w:shd w:fill="FBF8F1" w:color="auto" w:val="clear"/>
+            <w:tcMar>
+              <w:top w:type="dxa" w:w="70"/>
+              <w:left w:type="dxa" w:w="100"/>
+              <w:bottom w:type="dxa" w:w="50"/>
+              <w:right w:type="dxa" w:w="100"/>
+            </w:tcMar>
+          </w:tcPr>
+          <w:p>
+            <w:pPr>
+              <w:spacing w:after="40" w:line="252"/>
+            </w:pPr>
+            <w:r>
+              <w:rPr>
+                <w:sz w:val="18"/>
+                <w:szCs w:val="18"/>
+              </w:rPr>
+              <w:t xml:space="preserve">End-to-end workflow</w:t>
+            </w:r>
+          </w:p>
+        </w:tc>
+      </w:tr>
+    </w:tbl>
+    <w:p>
+      <w:pPr>
+        <w:spacing w:after="120"/>
+      </w:pPr>
+    </w:p>
+    <w:p>
+      <w:pPr>
+        <w:pStyle w:val="Heading2"/>
+        <w:keepNext/>
+      </w:pPr>
+      <w:r>
+        <w:t xml:space="preserve">12.4 Tools, results and how to run</w:t>
+      </w:r>
+    </w:p>
+    <w:p>
+      <w:pPr>
+        <w:pStyle w:val="ListParagraph"/>
+        <w:numPr>
+          <w:ilvl w:val="0"/>
+          <w:numId w:val="2"/>
+        </w:numPr>
+        <w:spacing w:after="60" w:line="270"/>
+      </w:pPr>
+      <w:r>
+        <w:rPr>
+          <w:b/>
+          <w:bCs/>
+        </w:rPr>
+        <w:t xml:space="preserve">Tools</w:t>
+      </w:r>
+      <w:r>
+        <w:t xml:space="preserve">: JUnit 5 (tests), Mockito (mocks), Spring Boot Test with MockMvc (web requests), Hamcrest (matchers), Maven Surefire (runner).</w:t>
+      </w:r>
+    </w:p>
+    <w:p>
+      <w:pPr>
+        <w:pStyle w:val="ListParagraph"/>
+        <w:numPr>
+          <w:ilvl w:val="0"/>
+          <w:numId w:val="2"/>
+        </w:numPr>
+        <w:spacing w:after="60" w:line="270"/>
+      </w:pPr>
+      <w:r>
+        <w:rPr>
+          <w:b/>
+          <w:bCs/>
+        </w:rPr>
+        <w:t xml:space="preserve">Last run (14 October 2026)</w:t>
+      </w:r>
+      <w:r>
+        <w:t xml:space="preserve">: 46 tests, 0 failures, 0 errors. That is 18 unit and controller tests plus 28 integration tests.</w:t>
+      </w:r>
+    </w:p>
+    <w:p>
+      <w:pPr>
+        <w:pStyle w:val="ListParagraph"/>
+        <w:numPr>
+          <w:ilvl w:val="0"/>
+          <w:numId w:val="2"/>
+        </w:numPr>
+        <w:spacing w:after="60" w:line="270"/>
+      </w:pPr>
+      <w:r>
+        <w:rPr>
+          <w:b/>
+          <w:bCs/>
+        </w:rPr>
+        <w:t xml:space="preserve">Run from IntelliJ</w:t>
+      </w:r>
+      <w:r>
+        <w:t xml:space="preserve">: right-click a test class and choose Run. </w:t>
+      </w:r>
+      <w:r>
+        <w:rPr>
+          <w:b/>
+          <w:bCs/>
+        </w:rPr>
+        <w:t xml:space="preserve">Run from Maven</w:t>
+      </w:r>
+      <w:r>
+        <w:t xml:space="preserve">: </w:t>
+      </w:r>
+      <w:r>
+        <w:rPr>
+          <w:rFonts w:ascii="Consolas" w:cs="Consolas" w:eastAsia="Consolas" w:hAnsi="Consolas"/>
+          <w:color w:val="681042"/>
+          <w:sz w:val="19"/>
+          <w:szCs w:val="19"/>
+        </w:rPr>
+        <w:t xml:space="preserve">mvn test -Dtest=BookingChangePolicyTests,BiometricOfficerControllerTests</w:t>
+      </w:r>
+      <w:r>
+        <w:t xml:space="preserve">.</w:t>
+      </w:r>
+    </w:p>
+    <w:p>
+      <w:pPr>
+        <w:pStyle w:val="ListParagraph"/>
+        <w:numPr>
+          <w:ilvl w:val="0"/>
+          <w:numId w:val="2"/>
+        </w:numPr>
+        <w:spacing w:after="60" w:line="270"/>
+      </w:pPr>
+      <w:r>
+        <w:rPr>
+          <w:b/>
+          <w:bCs/>
+        </w:rPr>
+        <w:t xml:space="preserve">Integration tests need</w:t>
+      </w:r>
+      <w:r>
+        <w:t xml:space="preserve"> the local SQL Server database </w:t>
+      </w:r>
+      <w:r>
+        <w:rPr>
+          <w:rFonts w:ascii="Consolas" w:cs="Consolas" w:eastAsia="Consolas" w:hAnsi="Consolas"/>
+          <w:color w:val="681042"/>
+          <w:sz w:val="19"/>
+          <w:szCs w:val="19"/>
+        </w:rPr>
+        <w:t xml:space="preserve">identity_issuance_service</w:t>
+      </w:r>
+      <w:r>
+        <w:t xml:space="preserve"> with the card-metadata migration applied (</w:t>
+      </w:r>
+      <w:r>
+        <w:rPr>
+          <w:rFonts w:ascii="Consolas" w:cs="Consolas" w:eastAsia="Consolas" w:hAnsi="Consolas"/>
+          <w:color w:val="681042"/>
+          <w:sz w:val="19"/>
+          <w:szCs w:val="19"/>
+        </w:rPr>
+        <w:t xml:space="preserve">database/payment-card-metadata.sql</w:t>
+      </w:r>
+      <w:r>
+        <w:t xml:space="preserve">). They roll back, so your data stays as it was.</w:t>
+      </w:r>
+    </w:p>
     <w:p>
       <w:pPr>
         <w:spacing w:after="120"/>
@@ -13658,6 +16882,134 @@
           </w:p>
         </w:tc>
       </w:tr>
+      <w:tr>
+        <w:trPr>
+          <w:cantSplit/>
+        </w:trPr>
+        <w:tc>
+          <w:tcPr>
+            <w:tcW w:type="dxa" w:w="3800"/>
+            <w:tcBorders>
+              <w:top w:val="single" w:color="D9D2C3" w:sz="4"/>
+              <w:left w:val="single" w:color="D9D2C3" w:sz="4"/>
+              <w:bottom w:val="single" w:color="D9D2C3" w:sz="4"/>
+              <w:right w:val="single" w:color="D9D2C3" w:sz="4"/>
+            </w:tcBorders>
+            <w:shd w:fill="FBF8F1" w:color="auto" w:val="clear"/>
+            <w:tcMar>
+              <w:top w:type="dxa" w:w="70"/>
+              <w:left w:type="dxa" w:w="100"/>
+              <w:bottom w:type="dxa" w:w="50"/>
+              <w:right w:type="dxa" w:w="100"/>
+            </w:tcMar>
+          </w:tcPr>
+          <w:p>
+            <w:pPr>
+              <w:spacing w:after="40" w:line="252"/>
+            </w:pPr>
+            <w:r>
+              <w:rPr>
+                <w:sz w:val="18"/>
+                <w:szCs w:val="18"/>
+              </w:rPr>
+              <w:t xml:space="preserve">What types of testing did you use?</w:t>
+            </w:r>
+          </w:p>
+        </w:tc>
+        <w:tc>
+          <w:tcPr>
+            <w:tcW w:type="dxa" w:w="5838"/>
+            <w:tcBorders>
+              <w:top w:val="single" w:color="D9D2C3" w:sz="4"/>
+              <w:left w:val="single" w:color="D9D2C3" w:sz="4"/>
+              <w:bottom w:val="single" w:color="D9D2C3" w:sz="4"/>
+              <w:right w:val="single" w:color="D9D2C3" w:sz="4"/>
+            </w:tcBorders>
+            <w:shd w:fill="FBF8F1" w:color="auto" w:val="clear"/>
+            <w:tcMar>
+              <w:top w:type="dxa" w:w="70"/>
+              <w:left w:type="dxa" w:w="100"/>
+              <w:bottom w:type="dxa" w:w="50"/>
+              <w:right w:type="dxa" w:w="100"/>
+            </w:tcMar>
+          </w:tcPr>
+          <w:p>
+            <w:pPr>
+              <w:spacing w:after="40" w:line="252"/>
+            </w:pPr>
+            <w:r>
+              <w:rPr>
+                <w:sz w:val="18"/>
+                <w:szCs w:val="18"/>
+              </w:rPr>
+              <w:t xml:space="preserve">Unit tests for the rule classes, controller tests with Mockito mocks, and integration tests that run the whole app on the real database. The integration tests are mostly black box: they send requests and check what the user sees. I also used boundary, negative and security cases, and re-ran everything after teammates changed the module.</w:t>
+            </w:r>
+          </w:p>
+        </w:tc>
+      </w:tr>
+      <w:tr>
+        <w:trPr>
+          <w:cantSplit/>
+        </w:trPr>
+        <w:tc>
+          <w:tcPr>
+            <w:tcW w:type="dxa" w:w="3800"/>
+            <w:tcBorders>
+              <w:top w:val="single" w:color="D9D2C3" w:sz="4"/>
+              <w:left w:val="single" w:color="D9D2C3" w:sz="4"/>
+              <w:bottom w:val="single" w:color="D9D2C3" w:sz="4"/>
+              <w:right w:val="single" w:color="D9D2C3" w:sz="4"/>
+            </w:tcBorders>
+            <w:tcMar>
+              <w:top w:type="dxa" w:w="70"/>
+              <w:left w:type="dxa" w:w="100"/>
+              <w:bottom w:type="dxa" w:w="50"/>
+              <w:right w:type="dxa" w:w="100"/>
+            </w:tcMar>
+          </w:tcPr>
+          <w:p>
+            <w:pPr>
+              <w:spacing w:after="40" w:line="252"/>
+            </w:pPr>
+            <w:r>
+              <w:rPr>
+                <w:sz w:val="18"/>
+                <w:szCs w:val="18"/>
+              </w:rPr>
+              <w:t xml:space="preserve">What is the difference between your unit and integration tests?</w:t>
+            </w:r>
+          </w:p>
+        </w:tc>
+        <w:tc>
+          <w:tcPr>
+            <w:tcW w:type="dxa" w:w="5838"/>
+            <w:tcBorders>
+              <w:top w:val="single" w:color="D9D2C3" w:sz="4"/>
+              <w:left w:val="single" w:color="D9D2C3" w:sz="4"/>
+              <w:bottom w:val="single" w:color="D9D2C3" w:sz="4"/>
+              <w:right w:val="single" w:color="D9D2C3" w:sz="4"/>
+            </w:tcBorders>
+            <w:tcMar>
+              <w:top w:type="dxa" w:w="70"/>
+              <w:left w:type="dxa" w:w="100"/>
+              <w:bottom w:type="dxa" w:w="50"/>
+              <w:right w:type="dxa" w:w="100"/>
+            </w:tcMar>
+          </w:tcPr>
+          <w:p>
+            <w:pPr>
+              <w:spacing w:after="40" w:line="252"/>
+            </w:pPr>
+            <w:r>
+              <w:rPr>
+                <w:sz w:val="18"/>
+                <w:szCs w:val="18"/>
+              </w:rPr>
+              <w:t xml:space="preserve">A unit test checks one class alone, so it is fast and needs no database. An integration test starts the whole application with SQL Server and checks that the controller, service and database work together. Each one rolls back afterwards.</w:t>
+            </w:r>
+          </w:p>
+        </w:tc>
+      </w:tr>
     </w:tbl>
     <w:p>
       <w:pPr>
@@ -13723,6 +17075,19 @@
       </w:pPr>
       <w:r>
         <w:t xml:space="preserve">Slots for today may be published even at past times, for demos. Citizens still cannot book a past slot.</w:t>
+      </w:r>
+    </w:p>
+    <w:p>
+      <w:pPr>
+        <w:pStyle w:val="ListParagraph"/>
+        <w:numPr>
+          <w:ilvl w:val="0"/>
+          <w:numId w:val="2"/>
+        </w:numPr>
+        <w:spacing w:after="60" w:line="270"/>
+      </w:pPr>
+      <w:r>
+        <w:t xml:space="preserve">There are no automated load or browser (UI) tests, and two people booking the last place at the same instant is protected by locks but not tested automatically.</w:t>
       </w:r>
     </w:p>
     <w:sectPr>

</xml_diff>